<commit_message>
docs(gtu): finalize printable Logbook with cleaned team table & annexure, and create standalone DineFlow_AI_GitHub_Summary.docx for submission
</commit_message>
<xml_diff>
--- a/docs/DineFlow_AI_GTU_Minor_Project_Logbook.docx
+++ b/docs/DineFlow_AI_GTU_Minor_Project_Logbook.docx
@@ -443,474 +443,6 @@
                 <w:sz w:val="20"/>
               </w:rPr>
               <w:t>Batch A</w:t>
-            </w:r>
-          </w:p>
-        </w:tc>
-      </w:tr>
-      <w:tr>
-        <w:tc>
-          <w:tcPr>
-            <w:tcW w:type="dxa" w:w="1921"/>
-            <w:tcMar>
-              <w:top w:w="140" w:type="dxa"/>
-              <w:bottom w:w="140" w:type="dxa"/>
-              <w:left w:w="100" w:type="dxa"/>
-              <w:right w:w="100" w:type="dxa"/>
-            </w:tcMar>
-          </w:tcPr>
-          <w:p>
-            <w:pPr>
-              <w:jc w:val="center"/>
-            </w:pPr>
-            <w:r>
-              <w:rPr>
-                <w:rFonts w:ascii="Times New Roman" w:hAnsi="Times New Roman"/>
-                <w:b/>
-                <w:sz w:val="20"/>
-              </w:rPr>
-              <w:t>2</w:t>
-            </w:r>
-          </w:p>
-        </w:tc>
-        <w:tc>
-          <w:tcPr>
-            <w:tcW w:type="dxa" w:w="1921"/>
-            <w:tcMar>
-              <w:top w:w="140" w:type="dxa"/>
-              <w:bottom w:w="140" w:type="dxa"/>
-              <w:left w:w="100" w:type="dxa"/>
-              <w:right w:w="100" w:type="dxa"/>
-            </w:tcMar>
-          </w:tcPr>
-          <w:p>
-            <w:pPr>
-              <w:jc w:val="center"/>
-            </w:pPr>
-            <w:r>
-              <w:rPr>
-                <w:rFonts w:ascii="Times New Roman" w:hAnsi="Times New Roman"/>
-                <w:sz w:val="20"/>
-              </w:rPr>
-              <w:t>[Enrollment Number]</w:t>
-            </w:r>
-          </w:p>
-        </w:tc>
-        <w:tc>
-          <w:tcPr>
-            <w:tcW w:type="dxa" w:w="1921"/>
-            <w:tcMar>
-              <w:top w:w="140" w:type="dxa"/>
-              <w:bottom w:w="140" w:type="dxa"/>
-              <w:left w:w="100" w:type="dxa"/>
-              <w:right w:w="100" w:type="dxa"/>
-            </w:tcMar>
-          </w:tcPr>
-          <w:p>
-            <w:pPr>
-              <w:jc w:val="left"/>
-            </w:pPr>
-            <w:r>
-              <w:rPr>
-                <w:rFonts w:ascii="Times New Roman" w:hAnsi="Times New Roman"/>
-                <w:sz w:val="20"/>
-              </w:rPr>
-              <w:t>[Student 2 Full Name]</w:t>
-            </w:r>
-          </w:p>
-        </w:tc>
-        <w:tc>
-          <w:tcPr>
-            <w:tcW w:type="dxa" w:w="1921"/>
-            <w:tcMar>
-              <w:top w:w="140" w:type="dxa"/>
-              <w:bottom w:w="140" w:type="dxa"/>
-              <w:left w:w="100" w:type="dxa"/>
-              <w:right w:w="100" w:type="dxa"/>
-            </w:tcMar>
-          </w:tcPr>
-          <w:p>
-            <w:pPr>
-              <w:jc w:val="center"/>
-            </w:pPr>
-            <w:r>
-              <w:rPr>
-                <w:rFonts w:ascii="Times New Roman" w:hAnsi="Times New Roman"/>
-                <w:sz w:val="20"/>
-              </w:rPr>
-              <w:t>5th Sem</w:t>
-            </w:r>
-          </w:p>
-        </w:tc>
-        <w:tc>
-          <w:tcPr>
-            <w:tcW w:type="dxa" w:w="1921"/>
-            <w:tcMar>
-              <w:top w:w="140" w:type="dxa"/>
-              <w:bottom w:w="140" w:type="dxa"/>
-              <w:left w:w="100" w:type="dxa"/>
-              <w:right w:w="100" w:type="dxa"/>
-            </w:tcMar>
-          </w:tcPr>
-          <w:p>
-            <w:pPr>
-              <w:jc w:val="center"/>
-            </w:pPr>
-            <w:r>
-              <w:rPr>
-                <w:rFonts w:ascii="Times New Roman" w:hAnsi="Times New Roman"/>
-                <w:sz w:val="20"/>
-              </w:rPr>
-              <w:t>Batch A</w:t>
-            </w:r>
-          </w:p>
-        </w:tc>
-      </w:tr>
-      <w:tr>
-        <w:tc>
-          <w:tcPr>
-            <w:tcW w:type="dxa" w:w="1921"/>
-            <w:tcMar>
-              <w:top w:w="140" w:type="dxa"/>
-              <w:bottom w:w="140" w:type="dxa"/>
-              <w:left w:w="100" w:type="dxa"/>
-              <w:right w:w="100" w:type="dxa"/>
-            </w:tcMar>
-          </w:tcPr>
-          <w:p>
-            <w:pPr>
-              <w:jc w:val="center"/>
-            </w:pPr>
-            <w:r>
-              <w:rPr>
-                <w:rFonts w:ascii="Times New Roman" w:hAnsi="Times New Roman"/>
-                <w:b/>
-                <w:sz w:val="20"/>
-              </w:rPr>
-              <w:t>3</w:t>
-            </w:r>
-          </w:p>
-        </w:tc>
-        <w:tc>
-          <w:tcPr>
-            <w:tcW w:type="dxa" w:w="1921"/>
-            <w:tcMar>
-              <w:top w:w="140" w:type="dxa"/>
-              <w:bottom w:w="140" w:type="dxa"/>
-              <w:left w:w="100" w:type="dxa"/>
-              <w:right w:w="100" w:type="dxa"/>
-            </w:tcMar>
-          </w:tcPr>
-          <w:p>
-            <w:pPr>
-              <w:jc w:val="center"/>
-            </w:pPr>
-            <w:r>
-              <w:rPr>
-                <w:rFonts w:ascii="Times New Roman" w:hAnsi="Times New Roman"/>
-                <w:sz w:val="20"/>
-              </w:rPr>
-              <w:t>[Enrollment Number]</w:t>
-            </w:r>
-          </w:p>
-        </w:tc>
-        <w:tc>
-          <w:tcPr>
-            <w:tcW w:type="dxa" w:w="1921"/>
-            <w:tcMar>
-              <w:top w:w="140" w:type="dxa"/>
-              <w:bottom w:w="140" w:type="dxa"/>
-              <w:left w:w="100" w:type="dxa"/>
-              <w:right w:w="100" w:type="dxa"/>
-            </w:tcMar>
-          </w:tcPr>
-          <w:p>
-            <w:pPr>
-              <w:jc w:val="left"/>
-            </w:pPr>
-            <w:r>
-              <w:rPr>
-                <w:rFonts w:ascii="Times New Roman" w:hAnsi="Times New Roman"/>
-                <w:sz w:val="20"/>
-              </w:rPr>
-              <w:t>[Student 3 Full Name]</w:t>
-            </w:r>
-          </w:p>
-        </w:tc>
-        <w:tc>
-          <w:tcPr>
-            <w:tcW w:type="dxa" w:w="1921"/>
-            <w:tcMar>
-              <w:top w:w="140" w:type="dxa"/>
-              <w:bottom w:w="140" w:type="dxa"/>
-              <w:left w:w="100" w:type="dxa"/>
-              <w:right w:w="100" w:type="dxa"/>
-            </w:tcMar>
-          </w:tcPr>
-          <w:p>
-            <w:pPr>
-              <w:jc w:val="center"/>
-            </w:pPr>
-            <w:r>
-              <w:rPr>
-                <w:rFonts w:ascii="Times New Roman" w:hAnsi="Times New Roman"/>
-                <w:sz w:val="20"/>
-              </w:rPr>
-              <w:t>5th Sem</w:t>
-            </w:r>
-          </w:p>
-        </w:tc>
-        <w:tc>
-          <w:tcPr>
-            <w:tcW w:type="dxa" w:w="1921"/>
-            <w:tcMar>
-              <w:top w:w="140" w:type="dxa"/>
-              <w:bottom w:w="140" w:type="dxa"/>
-              <w:left w:w="100" w:type="dxa"/>
-              <w:right w:w="100" w:type="dxa"/>
-            </w:tcMar>
-          </w:tcPr>
-          <w:p>
-            <w:pPr>
-              <w:jc w:val="center"/>
-            </w:pPr>
-            <w:r>
-              <w:rPr>
-                <w:rFonts w:ascii="Times New Roman" w:hAnsi="Times New Roman"/>
-                <w:sz w:val="20"/>
-              </w:rPr>
-              <w:t>Batch A</w:t>
-            </w:r>
-          </w:p>
-        </w:tc>
-      </w:tr>
-      <w:tr>
-        <w:tc>
-          <w:tcPr>
-            <w:tcW w:type="dxa" w:w="1921"/>
-            <w:tcMar>
-              <w:top w:w="140" w:type="dxa"/>
-              <w:bottom w:w="140" w:type="dxa"/>
-              <w:left w:w="100" w:type="dxa"/>
-              <w:right w:w="100" w:type="dxa"/>
-            </w:tcMar>
-          </w:tcPr>
-          <w:p>
-            <w:pPr>
-              <w:jc w:val="center"/>
-            </w:pPr>
-            <w:r>
-              <w:rPr>
-                <w:rFonts w:ascii="Times New Roman" w:hAnsi="Times New Roman"/>
-                <w:b/>
-                <w:sz w:val="20"/>
-              </w:rPr>
-              <w:t>4</w:t>
-            </w:r>
-          </w:p>
-        </w:tc>
-        <w:tc>
-          <w:tcPr>
-            <w:tcW w:type="dxa" w:w="1921"/>
-            <w:tcMar>
-              <w:top w:w="140" w:type="dxa"/>
-              <w:bottom w:w="140" w:type="dxa"/>
-              <w:left w:w="100" w:type="dxa"/>
-              <w:right w:w="100" w:type="dxa"/>
-            </w:tcMar>
-          </w:tcPr>
-          <w:p>
-            <w:pPr>
-              <w:jc w:val="center"/>
-            </w:pPr>
-            <w:r>
-              <w:rPr>
-                <w:rFonts w:ascii="Times New Roman" w:hAnsi="Times New Roman"/>
-                <w:sz w:val="20"/>
-              </w:rPr>
-              <w:t>[Enrollment Number]</w:t>
-            </w:r>
-          </w:p>
-        </w:tc>
-        <w:tc>
-          <w:tcPr>
-            <w:tcW w:type="dxa" w:w="1921"/>
-            <w:tcMar>
-              <w:top w:w="140" w:type="dxa"/>
-              <w:bottom w:w="140" w:type="dxa"/>
-              <w:left w:w="100" w:type="dxa"/>
-              <w:right w:w="100" w:type="dxa"/>
-            </w:tcMar>
-          </w:tcPr>
-          <w:p>
-            <w:pPr>
-              <w:jc w:val="left"/>
-            </w:pPr>
-            <w:r>
-              <w:rPr>
-                <w:rFonts w:ascii="Times New Roman" w:hAnsi="Times New Roman"/>
-                <w:sz w:val="20"/>
-              </w:rPr>
-              <w:t>[Student 4 Full Name]</w:t>
-            </w:r>
-          </w:p>
-        </w:tc>
-        <w:tc>
-          <w:tcPr>
-            <w:tcW w:type="dxa" w:w="1921"/>
-            <w:tcMar>
-              <w:top w:w="140" w:type="dxa"/>
-              <w:bottom w:w="140" w:type="dxa"/>
-              <w:left w:w="100" w:type="dxa"/>
-              <w:right w:w="100" w:type="dxa"/>
-            </w:tcMar>
-          </w:tcPr>
-          <w:p>
-            <w:pPr>
-              <w:jc w:val="center"/>
-            </w:pPr>
-            <w:r>
-              <w:rPr>
-                <w:rFonts w:ascii="Times New Roman" w:hAnsi="Times New Roman"/>
-                <w:sz w:val="20"/>
-              </w:rPr>
-              <w:t>5th Sem</w:t>
-            </w:r>
-          </w:p>
-        </w:tc>
-        <w:tc>
-          <w:tcPr>
-            <w:tcW w:type="dxa" w:w="1921"/>
-            <w:tcMar>
-              <w:top w:w="140" w:type="dxa"/>
-              <w:bottom w:w="140" w:type="dxa"/>
-              <w:left w:w="100" w:type="dxa"/>
-              <w:right w:w="100" w:type="dxa"/>
-            </w:tcMar>
-          </w:tcPr>
-          <w:p>
-            <w:pPr>
-              <w:jc w:val="center"/>
-            </w:pPr>
-            <w:r>
-              <w:rPr>
-                <w:rFonts w:ascii="Times New Roman" w:hAnsi="Times New Roman"/>
-                <w:sz w:val="20"/>
-              </w:rPr>
-              <w:t>Batch A</w:t>
-            </w:r>
-          </w:p>
-        </w:tc>
-      </w:tr>
-      <w:tr>
-        <w:tc>
-          <w:tcPr>
-            <w:tcW w:type="dxa" w:w="1921"/>
-            <w:tcMar>
-              <w:top w:w="140" w:type="dxa"/>
-              <w:bottom w:w="140" w:type="dxa"/>
-              <w:left w:w="100" w:type="dxa"/>
-              <w:right w:w="100" w:type="dxa"/>
-            </w:tcMar>
-          </w:tcPr>
-          <w:p>
-            <w:pPr>
-              <w:jc w:val="center"/>
-            </w:pPr>
-            <w:r>
-              <w:rPr>
-                <w:rFonts w:ascii="Times New Roman" w:hAnsi="Times New Roman"/>
-                <w:b/>
-                <w:sz w:val="20"/>
-              </w:rPr>
-              <w:t>5</w:t>
-            </w:r>
-          </w:p>
-        </w:tc>
-        <w:tc>
-          <w:tcPr>
-            <w:tcW w:type="dxa" w:w="1921"/>
-            <w:tcMar>
-              <w:top w:w="140" w:type="dxa"/>
-              <w:bottom w:w="140" w:type="dxa"/>
-              <w:left w:w="100" w:type="dxa"/>
-              <w:right w:w="100" w:type="dxa"/>
-            </w:tcMar>
-          </w:tcPr>
-          <w:p>
-            <w:pPr>
-              <w:jc w:val="center"/>
-            </w:pPr>
-            <w:r>
-              <w:rPr>
-                <w:rFonts w:ascii="Times New Roman" w:hAnsi="Times New Roman"/>
-                <w:sz w:val="20"/>
-              </w:rPr>
-            </w:r>
-          </w:p>
-        </w:tc>
-        <w:tc>
-          <w:tcPr>
-            <w:tcW w:type="dxa" w:w="1921"/>
-            <w:tcMar>
-              <w:top w:w="140" w:type="dxa"/>
-              <w:bottom w:w="140" w:type="dxa"/>
-              <w:left w:w="100" w:type="dxa"/>
-              <w:right w:w="100" w:type="dxa"/>
-            </w:tcMar>
-          </w:tcPr>
-          <w:p>
-            <w:pPr>
-              <w:jc w:val="left"/>
-            </w:pPr>
-            <w:r>
-              <w:rPr>
-                <w:rFonts w:ascii="Times New Roman" w:hAnsi="Times New Roman"/>
-                <w:sz w:val="20"/>
-              </w:rPr>
-            </w:r>
-          </w:p>
-        </w:tc>
-        <w:tc>
-          <w:tcPr>
-            <w:tcW w:type="dxa" w:w="1921"/>
-            <w:tcMar>
-              <w:top w:w="140" w:type="dxa"/>
-              <w:bottom w:w="140" w:type="dxa"/>
-              <w:left w:w="100" w:type="dxa"/>
-              <w:right w:w="100" w:type="dxa"/>
-            </w:tcMar>
-          </w:tcPr>
-          <w:p>
-            <w:pPr>
-              <w:jc w:val="center"/>
-            </w:pPr>
-            <w:r>
-              <w:rPr>
-                <w:rFonts w:ascii="Times New Roman" w:hAnsi="Times New Roman"/>
-                <w:sz w:val="20"/>
-              </w:rPr>
-            </w:r>
-          </w:p>
-        </w:tc>
-        <w:tc>
-          <w:tcPr>
-            <w:tcW w:type="dxa" w:w="1921"/>
-            <w:tcMar>
-              <w:top w:w="140" w:type="dxa"/>
-              <w:bottom w:w="140" w:type="dxa"/>
-              <w:left w:w="100" w:type="dxa"/>
-              <w:right w:w="100" w:type="dxa"/>
-            </w:tcMar>
-          </w:tcPr>
-          <w:p>
-            <w:pPr>
-              <w:jc w:val="center"/>
-            </w:pPr>
-            <w:r>
-              <w:rPr>
-                <w:rFonts w:ascii="Times New Roman" w:hAnsi="Times New Roman"/>
-                <w:sz w:val="20"/>
-              </w:rPr>
             </w:r>
           </w:p>
         </w:tc>
@@ -3513,6 +3045,1037 @@
         </w:tc>
       </w:tr>
     </w:tbl>
+    <w:p>
+      <w:r>
+        <w:br w:type="page"/>
+      </w:r>
+    </w:p>
+    <w:p>
+      <w:pPr>
+        <w:spacing w:before="160" w:after="40"/>
+        <w:jc w:val="center"/>
+      </w:pPr>
+      <w:r>
+        <w:rPr>
+          <w:rFonts w:ascii="Times New Roman" w:hAnsi="Times New Roman"/>
+          <w:b/>
+          <w:color w:val="1E3A8A"/>
+          <w:sz w:val="24"/>
+        </w:rPr>
+        <w:t>ANNEXURE: OFFICIAL GITHUB REPOSITORY &amp; CODE CONTRIBUTION SUMMARY</w:t>
+      </w:r>
+    </w:p>
+    <w:p>
+      <w:pPr>
+        <w:spacing w:after="160"/>
+        <w:jc w:val="center"/>
+      </w:pPr>
+      <w:r>
+        <w:rPr>
+          <w:rFonts w:ascii="Times New Roman" w:hAnsi="Times New Roman"/>
+          <w:b/>
+          <w:color w:val="059669"/>
+          <w:sz w:val="20"/>
+        </w:rPr>
+        <w:t>DineFlow AI: Minor Project (DI05000341) | Git Verification Record</w:t>
+      </w:r>
+    </w:p>
+    <w:tbl>
+      <w:tblPr>
+        <w:tblW w:type="auto" w:w="0"/>
+        <w:jc w:val="center"/>
+        <w:tblLook w:firstColumn="1" w:firstRow="1" w:lastColumn="0" w:lastRow="0" w:noHBand="0" w:noVBand="1" w:val="04A0"/>
+        <w:tblBorders>
+          <w:top w:val="single" w:sz="6" w:space="0" w:color="CBD5E1"/>
+          <w:left w:val="single" w:sz="4" w:space="0" w:color="CBD5E1"/>
+          <w:bottom w:val="single" w:sz="6" w:space="0" w:color="CBD5E1"/>
+          <w:right w:val="single" w:sz="4" w:space="0" w:color="CBD5E1"/>
+          <w:insideH w:val="single" w:sz="4" w:space="0" w:color="CBD5E1"/>
+          <w:insideV w:val="single" w:sz="4" w:space="0" w:color="CBD5E1"/>
+        </w:tblBorders>
+      </w:tblPr>
+      <w:tblGrid>
+        <w:gridCol w:w="3168"/>
+        <w:gridCol w:w="6480"/>
+      </w:tblGrid>
+      <w:tr>
+        <w:tc>
+          <w:tcPr>
+            <w:tcW w:type="dxa" w:w="4802"/>
+            <w:tcMar>
+              <w:top w:w="30" w:type="dxa"/>
+              <w:bottom w:w="30" w:type="dxa"/>
+              <w:left w:w="60" w:type="dxa"/>
+              <w:right w:w="60" w:type="dxa"/>
+            </w:tcMar>
+          </w:tcPr>
+          <w:p>
+            <w:r>
+              <w:rPr>
+                <w:b/>
+                <w:sz w:val="18"/>
+              </w:rPr>
+              <w:t>Public GitHub Repository</w:t>
+            </w:r>
+          </w:p>
+        </w:tc>
+        <w:tc>
+          <w:tcPr>
+            <w:tcW w:type="dxa" w:w="4802"/>
+            <w:tcMar>
+              <w:top w:w="30" w:type="dxa"/>
+              <w:bottom w:w="30" w:type="dxa"/>
+              <w:left w:w="60" w:type="dxa"/>
+              <w:right w:w="60" w:type="dxa"/>
+            </w:tcMar>
+          </w:tcPr>
+          <w:p>
+            <w:r>
+              <w:rPr>
+                <w:b/>
+                <w:color w:val="1D4ED8"/>
+                <w:sz w:val="18"/>
+              </w:rPr>
+              <w:t>https://github.com/Shubh-Patel-07/DineFlow-AI</w:t>
+            </w:r>
+          </w:p>
+        </w:tc>
+      </w:tr>
+      <w:tr>
+        <w:tc>
+          <w:tcPr>
+            <w:tcW w:type="dxa" w:w="4802"/>
+            <w:tcMar>
+              <w:top w:w="30" w:type="dxa"/>
+              <w:bottom w:w="30" w:type="dxa"/>
+              <w:left w:w="60" w:type="dxa"/>
+              <w:right w:w="60" w:type="dxa"/>
+            </w:tcMar>
+            <w:shd w:fill="F8FAFC"/>
+          </w:tcPr>
+          <w:p>
+            <w:r>
+              <w:rPr>
+                <w:b/>
+                <w:sz w:val="18"/>
+              </w:rPr>
+              <w:t>Candidate &amp; Enrolment</w:t>
+            </w:r>
+          </w:p>
+        </w:tc>
+        <w:tc>
+          <w:tcPr>
+            <w:tcW w:type="dxa" w:w="4802"/>
+            <w:tcMar>
+              <w:top w:w="30" w:type="dxa"/>
+              <w:bottom w:w="30" w:type="dxa"/>
+              <w:left w:w="60" w:type="dxa"/>
+              <w:right w:w="60" w:type="dxa"/>
+            </w:tcMar>
+            <w:shd w:fill="F8FAFC"/>
+          </w:tcPr>
+          <w:p>
+            <w:r>
+              <w:rPr>
+                <w:sz w:val="18"/>
+              </w:rPr>
+              <w:t>PATEL SHUBH MAHESHKUMAR (246310307123)</w:t>
+            </w:r>
+          </w:p>
+        </w:tc>
+      </w:tr>
+      <w:tr>
+        <w:tc>
+          <w:tcPr>
+            <w:tcW w:type="dxa" w:w="4802"/>
+            <w:tcMar>
+              <w:top w:w="30" w:type="dxa"/>
+              <w:bottom w:w="30" w:type="dxa"/>
+              <w:left w:w="60" w:type="dxa"/>
+              <w:right w:w="60" w:type="dxa"/>
+            </w:tcMar>
+          </w:tcPr>
+          <w:p>
+            <w:r>
+              <w:rPr>
+                <w:b/>
+                <w:sz w:val="18"/>
+              </w:rPr>
+              <w:t>Project Guide &amp; Dept.</w:t>
+            </w:r>
+          </w:p>
+        </w:tc>
+        <w:tc>
+          <w:tcPr>
+            <w:tcW w:type="dxa" w:w="4802"/>
+            <w:tcMar>
+              <w:top w:w="30" w:type="dxa"/>
+              <w:bottom w:w="30" w:type="dxa"/>
+              <w:left w:w="60" w:type="dxa"/>
+              <w:right w:w="60" w:type="dxa"/>
+            </w:tcMar>
+          </w:tcPr>
+          <w:p>
+            <w:r>
+              <w:rPr>
+                <w:sz w:val="18"/>
+              </w:rPr>
+              <w:t>Prof. Yagnesh Patel | Computer Engineering, KDP Patan</w:t>
+            </w:r>
+          </w:p>
+        </w:tc>
+      </w:tr>
+      <w:tr>
+        <w:tc>
+          <w:tcPr>
+            <w:tcW w:type="dxa" w:w="4802"/>
+            <w:tcMar>
+              <w:top w:w="30" w:type="dxa"/>
+              <w:bottom w:w="30" w:type="dxa"/>
+              <w:left w:w="60" w:type="dxa"/>
+              <w:right w:w="60" w:type="dxa"/>
+            </w:tcMar>
+            <w:shd w:fill="F8FAFC"/>
+          </w:tcPr>
+          <w:p>
+            <w:r>
+              <w:rPr>
+                <w:b/>
+                <w:sz w:val="18"/>
+              </w:rPr>
+              <w:t>Primary Active Branches</w:t>
+            </w:r>
+          </w:p>
+        </w:tc>
+        <w:tc>
+          <w:tcPr>
+            <w:tcW w:type="dxa" w:w="4802"/>
+            <w:tcMar>
+              <w:top w:w="30" w:type="dxa"/>
+              <w:bottom w:w="30" w:type="dxa"/>
+              <w:left w:w="60" w:type="dxa"/>
+              <w:right w:w="60" w:type="dxa"/>
+            </w:tcMar>
+            <w:shd w:fill="F8FAFC"/>
+          </w:tcPr>
+          <w:p>
+            <w:r>
+              <w:rPr>
+                <w:sz w:val="18"/>
+              </w:rPr>
+              <w:t>main, feature-teamlead, feature/smp/react-native-app</w:t>
+            </w:r>
+          </w:p>
+        </w:tc>
+      </w:tr>
+      <w:tr>
+        <w:tc>
+          <w:tcPr>
+            <w:tcW w:type="dxa" w:w="4802"/>
+            <w:tcMar>
+              <w:top w:w="30" w:type="dxa"/>
+              <w:bottom w:w="30" w:type="dxa"/>
+              <w:left w:w="60" w:type="dxa"/>
+              <w:right w:w="60" w:type="dxa"/>
+            </w:tcMar>
+          </w:tcPr>
+          <w:p>
+            <w:r>
+              <w:rPr>
+                <w:b/>
+                <w:sz w:val="18"/>
+              </w:rPr>
+              <w:t>Live AWS Cloud Server</w:t>
+            </w:r>
+          </w:p>
+        </w:tc>
+        <w:tc>
+          <w:tcPr>
+            <w:tcW w:type="dxa" w:w="4802"/>
+            <w:tcMar>
+              <w:top w:w="30" w:type="dxa"/>
+              <w:bottom w:w="30" w:type="dxa"/>
+              <w:left w:w="60" w:type="dxa"/>
+              <w:right w:w="60" w:type="dxa"/>
+            </w:tcMar>
+          </w:tcPr>
+          <w:p>
+            <w:r>
+              <w:rPr>
+                <w:b/>
+                <w:color w:val="1D4ED8"/>
+                <w:sz w:val="18"/>
+              </w:rPr>
+              <w:t>https://dineflowai.duckdns.org (Ubuntu 24.04 LTS)</w:t>
+            </w:r>
+          </w:p>
+        </w:tc>
+      </w:tr>
+    </w:tbl>
+    <w:p>
+      <w:pPr>
+        <w:spacing w:before="160" w:after="80"/>
+      </w:pPr>
+      <w:r>
+        <w:rPr>
+          <w:b/>
+          <w:color w:val="1E3A8A"/>
+          <w:sz w:val="20"/>
+        </w:rPr>
+        <w:t>Key Verified Git Commits (Semester Progress Tracking):</w:t>
+      </w:r>
+    </w:p>
+    <w:tbl>
+      <w:tblPr>
+        <w:tblW w:type="auto" w:w="0"/>
+        <w:jc w:val="center"/>
+        <w:tblLook w:firstColumn="1" w:firstRow="1" w:lastColumn="0" w:lastRow="0" w:noHBand="0" w:noVBand="1" w:val="04A0"/>
+        <w:tblBorders>
+          <w:top w:val="single" w:sz="6" w:space="0" w:color="CBD5E1"/>
+          <w:left w:val="single" w:sz="4" w:space="0" w:color="CBD5E1"/>
+          <w:bottom w:val="single" w:sz="6" w:space="0" w:color="CBD5E1"/>
+          <w:right w:val="single" w:sz="4" w:space="0" w:color="CBD5E1"/>
+          <w:insideH w:val="single" w:sz="4" w:space="0" w:color="CBD5E1"/>
+          <w:insideV w:val="single" w:sz="4" w:space="0" w:color="CBD5E1"/>
+        </w:tblBorders>
+      </w:tblPr>
+      <w:tblGrid>
+        <w:gridCol w:w="1296"/>
+        <w:gridCol w:w="1584"/>
+        <w:gridCol w:w="6768"/>
+      </w:tblGrid>
+      <w:tr>
+        <w:tc>
+          <w:tcPr>
+            <w:tcW w:type="dxa" w:w="3202"/>
+            <w:tcMar>
+              <w:top w:w="35" w:type="dxa"/>
+              <w:bottom w:w="35" w:type="dxa"/>
+              <w:left w:w="50" w:type="dxa"/>
+              <w:right w:w="50" w:type="dxa"/>
+            </w:tcMar>
+            <w:shd w:fill="1E3A8A"/>
+          </w:tcPr>
+          <w:p>
+            <w:pPr>
+              <w:jc w:val="center"/>
+            </w:pPr>
+            <w:r>
+              <w:rPr>
+                <w:b/>
+                <w:color w:val="FFFFFF"/>
+                <w:sz w:val="18"/>
+              </w:rPr>
+              <w:t>Commit SHA</w:t>
+            </w:r>
+          </w:p>
+        </w:tc>
+        <w:tc>
+          <w:tcPr>
+            <w:tcW w:type="dxa" w:w="3202"/>
+            <w:tcMar>
+              <w:top w:w="35" w:type="dxa"/>
+              <w:bottom w:w="35" w:type="dxa"/>
+              <w:left w:w="50" w:type="dxa"/>
+              <w:right w:w="50" w:type="dxa"/>
+            </w:tcMar>
+            <w:shd w:fill="1E3A8A"/>
+          </w:tcPr>
+          <w:p>
+            <w:pPr>
+              <w:jc w:val="center"/>
+            </w:pPr>
+            <w:r>
+              <w:rPr>
+                <w:b/>
+                <w:color w:val="FFFFFF"/>
+                <w:sz w:val="18"/>
+              </w:rPr>
+              <w:t>Date</w:t>
+            </w:r>
+          </w:p>
+        </w:tc>
+        <w:tc>
+          <w:tcPr>
+            <w:tcW w:type="dxa" w:w="3202"/>
+            <w:tcMar>
+              <w:top w:w="35" w:type="dxa"/>
+              <w:bottom w:w="35" w:type="dxa"/>
+              <w:left w:w="50" w:type="dxa"/>
+              <w:right w:w="50" w:type="dxa"/>
+            </w:tcMar>
+            <w:shd w:fill="1E3A8A"/>
+          </w:tcPr>
+          <w:p>
+            <w:pPr>
+              <w:jc w:val="center"/>
+            </w:pPr>
+            <w:r>
+              <w:rPr>
+                <w:b/>
+                <w:color w:val="FFFFFF"/>
+                <w:sz w:val="18"/>
+              </w:rPr>
+              <w:t>Verified Engineering Deliverable Summary</w:t>
+            </w:r>
+          </w:p>
+        </w:tc>
+      </w:tr>
+      <w:tr>
+        <w:tc>
+          <w:tcPr>
+            <w:tcW w:type="dxa" w:w="3202"/>
+            <w:tcMar>
+              <w:top w:w="25" w:type="dxa"/>
+              <w:bottom w:w="25" w:type="dxa"/>
+              <w:left w:w="40" w:type="dxa"/>
+              <w:right w:w="40" w:type="dxa"/>
+            </w:tcMar>
+          </w:tcPr>
+          <w:p>
+            <w:pPr>
+              <w:jc w:val="center"/>
+            </w:pPr>
+            <w:r>
+              <w:rPr>
+                <w:rFonts w:ascii="Consolas" w:hAnsi="Consolas"/>
+                <w:b/>
+                <w:color w:val="1E3A8A"/>
+                <w:sz w:val="16"/>
+              </w:rPr>
+              <w:t>749c654</w:t>
+            </w:r>
+          </w:p>
+        </w:tc>
+        <w:tc>
+          <w:tcPr>
+            <w:tcW w:type="dxa" w:w="3202"/>
+            <w:tcMar>
+              <w:top w:w="25" w:type="dxa"/>
+              <w:bottom w:w="25" w:type="dxa"/>
+              <w:left w:w="40" w:type="dxa"/>
+              <w:right w:w="40" w:type="dxa"/>
+            </w:tcMar>
+          </w:tcPr>
+          <w:p>
+            <w:pPr>
+              <w:jc w:val="center"/>
+            </w:pPr>
+            <w:r>
+              <w:rPr>
+                <w:sz w:val="16"/>
+              </w:rPr>
+              <w:t>2026-10-28</w:t>
+            </w:r>
+          </w:p>
+        </w:tc>
+        <w:tc>
+          <w:tcPr>
+            <w:tcW w:type="dxa" w:w="3202"/>
+            <w:tcMar>
+              <w:top w:w="25" w:type="dxa"/>
+              <w:bottom w:w="25" w:type="dxa"/>
+              <w:left w:w="50" w:type="dxa"/>
+              <w:right w:w="50" w:type="dxa"/>
+            </w:tcMar>
+          </w:tcPr>
+          <w:p>
+            <w:r>
+              <w:rPr>
+                <w:sz w:val="16"/>
+              </w:rPr>
+              <w:t>docs(gtu): align Slide 3 industry stats and Slide 11 4-stage build sequence with GTU demo PPT</w:t>
+            </w:r>
+          </w:p>
+        </w:tc>
+      </w:tr>
+      <w:tr>
+        <w:tc>
+          <w:tcPr>
+            <w:tcW w:type="dxa" w:w="3202"/>
+            <w:tcMar>
+              <w:top w:w="25" w:type="dxa"/>
+              <w:bottom w:w="25" w:type="dxa"/>
+              <w:left w:w="40" w:type="dxa"/>
+              <w:right w:w="40" w:type="dxa"/>
+            </w:tcMar>
+            <w:shd w:fill="F8FAFC"/>
+          </w:tcPr>
+          <w:p>
+            <w:pPr>
+              <w:jc w:val="center"/>
+            </w:pPr>
+            <w:r>
+              <w:rPr>
+                <w:rFonts w:ascii="Consolas" w:hAnsi="Consolas"/>
+                <w:b/>
+                <w:color w:val="1E3A8A"/>
+                <w:sz w:val="16"/>
+              </w:rPr>
+              <w:t>132c046</w:t>
+            </w:r>
+          </w:p>
+        </w:tc>
+        <w:tc>
+          <w:tcPr>
+            <w:tcW w:type="dxa" w:w="3202"/>
+            <w:tcMar>
+              <w:top w:w="25" w:type="dxa"/>
+              <w:bottom w:w="25" w:type="dxa"/>
+              <w:left w:w="40" w:type="dxa"/>
+              <w:right w:w="40" w:type="dxa"/>
+            </w:tcMar>
+            <w:shd w:fill="F8FAFC"/>
+          </w:tcPr>
+          <w:p>
+            <w:pPr>
+              <w:jc w:val="center"/>
+            </w:pPr>
+            <w:r>
+              <w:rPr>
+                <w:sz w:val="16"/>
+              </w:rPr>
+              <w:t>2026-10-28</w:t>
+            </w:r>
+          </w:p>
+        </w:tc>
+        <w:tc>
+          <w:tcPr>
+            <w:tcW w:type="dxa" w:w="3202"/>
+            <w:tcMar>
+              <w:top w:w="25" w:type="dxa"/>
+              <w:bottom w:w="25" w:type="dxa"/>
+              <w:left w:w="50" w:type="dxa"/>
+              <w:right w:w="50" w:type="dxa"/>
+            </w:tcMar>
+            <w:shd w:fill="F8FAFC"/>
+          </w:tcPr>
+          <w:p>
+            <w:r>
+              <w:rPr>
+                <w:sz w:val="16"/>
+              </w:rPr>
+              <w:t>docs(gtu): remove BOM section, format algorithms in formal CS boxes, convert PPT to 100% light theme</w:t>
+            </w:r>
+          </w:p>
+        </w:tc>
+      </w:tr>
+      <w:tr>
+        <w:tc>
+          <w:tcPr>
+            <w:tcW w:type="dxa" w:w="3202"/>
+            <w:tcMar>
+              <w:top w:w="25" w:type="dxa"/>
+              <w:bottom w:w="25" w:type="dxa"/>
+              <w:left w:w="40" w:type="dxa"/>
+              <w:right w:w="40" w:type="dxa"/>
+            </w:tcMar>
+          </w:tcPr>
+          <w:p>
+            <w:pPr>
+              <w:jc w:val="center"/>
+            </w:pPr>
+            <w:r>
+              <w:rPr>
+                <w:rFonts w:ascii="Consolas" w:hAnsi="Consolas"/>
+                <w:b/>
+                <w:color w:val="1E3A8A"/>
+                <w:sz w:val="16"/>
+              </w:rPr>
+              <w:t>b338628</w:t>
+            </w:r>
+          </w:p>
+        </w:tc>
+        <w:tc>
+          <w:tcPr>
+            <w:tcW w:type="dxa" w:w="3202"/>
+            <w:tcMar>
+              <w:top w:w="25" w:type="dxa"/>
+              <w:bottom w:w="25" w:type="dxa"/>
+              <w:left w:w="40" w:type="dxa"/>
+              <w:right w:w="40" w:type="dxa"/>
+            </w:tcMar>
+          </w:tcPr>
+          <w:p>
+            <w:pPr>
+              <w:jc w:val="center"/>
+            </w:pPr>
+            <w:r>
+              <w:rPr>
+                <w:sz w:val="16"/>
+              </w:rPr>
+              <w:t>2026-10-28</w:t>
+            </w:r>
+          </w:p>
+        </w:tc>
+        <w:tc>
+          <w:tcPr>
+            <w:tcW w:type="dxa" w:w="3202"/>
+            <w:tcMar>
+              <w:top w:w="25" w:type="dxa"/>
+              <w:bottom w:w="25" w:type="dxa"/>
+              <w:left w:w="50" w:type="dxa"/>
+              <w:right w:w="50" w:type="dxa"/>
+            </w:tcMar>
+          </w:tcPr>
+          <w:p>
+            <w:r>
+              <w:rPr>
+                <w:sz w:val="16"/>
+              </w:rPr>
+              <w:t>docs(gtu): finalize 18-slide PPTX, 8-chapter DOCX report with embedded block/circuit/flowchart diagrams</w:t>
+            </w:r>
+          </w:p>
+        </w:tc>
+      </w:tr>
+      <w:tr>
+        <w:tc>
+          <w:tcPr>
+            <w:tcW w:type="dxa" w:w="3202"/>
+            <w:tcMar>
+              <w:top w:w="25" w:type="dxa"/>
+              <w:bottom w:w="25" w:type="dxa"/>
+              <w:left w:w="40" w:type="dxa"/>
+              <w:right w:w="40" w:type="dxa"/>
+            </w:tcMar>
+            <w:shd w:fill="F8FAFC"/>
+          </w:tcPr>
+          <w:p>
+            <w:pPr>
+              <w:jc w:val="center"/>
+            </w:pPr>
+            <w:r>
+              <w:rPr>
+                <w:rFonts w:ascii="Consolas" w:hAnsi="Consolas"/>
+                <w:b/>
+                <w:color w:val="1E3A8A"/>
+                <w:sz w:val="16"/>
+              </w:rPr>
+              <w:t>cf1b1c2</w:t>
+            </w:r>
+          </w:p>
+        </w:tc>
+        <w:tc>
+          <w:tcPr>
+            <w:tcW w:type="dxa" w:w="3202"/>
+            <w:tcMar>
+              <w:top w:w="25" w:type="dxa"/>
+              <w:bottom w:w="25" w:type="dxa"/>
+              <w:left w:w="40" w:type="dxa"/>
+              <w:right w:w="40" w:type="dxa"/>
+            </w:tcMar>
+            <w:shd w:fill="F8FAFC"/>
+          </w:tcPr>
+          <w:p>
+            <w:pPr>
+              <w:jc w:val="center"/>
+            </w:pPr>
+            <w:r>
+              <w:rPr>
+                <w:sz w:val="16"/>
+              </w:rPr>
+              <w:t>2026-10-28</w:t>
+            </w:r>
+          </w:p>
+        </w:tc>
+        <w:tc>
+          <w:tcPr>
+            <w:tcW w:type="dxa" w:w="3202"/>
+            <w:tcMar>
+              <w:top w:w="25" w:type="dxa"/>
+              <w:bottom w:w="25" w:type="dxa"/>
+              <w:left w:w="50" w:type="dxa"/>
+              <w:right w:w="50" w:type="dxa"/>
+            </w:tcMar>
+            <w:shd w:fill="F8FAFC"/>
+          </w:tcPr>
+          <w:p>
+            <w:r>
+              <w:rPr>
+                <w:sz w:val="16"/>
+              </w:rPr>
+              <w:t>feat(customer-menu): switch default theme to Light Emerald Green matching mobile app branding</w:t>
+            </w:r>
+          </w:p>
+        </w:tc>
+      </w:tr>
+      <w:tr>
+        <w:tc>
+          <w:tcPr>
+            <w:tcW w:type="dxa" w:w="3202"/>
+            <w:tcMar>
+              <w:top w:w="25" w:type="dxa"/>
+              <w:bottom w:w="25" w:type="dxa"/>
+              <w:left w:w="40" w:type="dxa"/>
+              <w:right w:w="40" w:type="dxa"/>
+            </w:tcMar>
+          </w:tcPr>
+          <w:p>
+            <w:pPr>
+              <w:jc w:val="center"/>
+            </w:pPr>
+            <w:r>
+              <w:rPr>
+                <w:rFonts w:ascii="Consolas" w:hAnsi="Consolas"/>
+                <w:b/>
+                <w:color w:val="1E3A8A"/>
+                <w:sz w:val="16"/>
+              </w:rPr>
+              <w:t>cae3bbd</w:t>
+            </w:r>
+          </w:p>
+        </w:tc>
+        <w:tc>
+          <w:tcPr>
+            <w:tcW w:type="dxa" w:w="3202"/>
+            <w:tcMar>
+              <w:top w:w="25" w:type="dxa"/>
+              <w:bottom w:w="25" w:type="dxa"/>
+              <w:left w:w="40" w:type="dxa"/>
+              <w:right w:w="40" w:type="dxa"/>
+            </w:tcMar>
+          </w:tcPr>
+          <w:p>
+            <w:pPr>
+              <w:jc w:val="center"/>
+            </w:pPr>
+            <w:r>
+              <w:rPr>
+                <w:sz w:val="16"/>
+              </w:rPr>
+              <w:t>2026-10-28</w:t>
+            </w:r>
+          </w:p>
+        </w:tc>
+        <w:tc>
+          <w:tcPr>
+            <w:tcW w:type="dxa" w:w="3202"/>
+            <w:tcMar>
+              <w:top w:w="25" w:type="dxa"/>
+              <w:bottom w:w="25" w:type="dxa"/>
+              <w:left w:w="50" w:type="dxa"/>
+              <w:right w:w="50" w:type="dxa"/>
+            </w:tcMar>
+          </w:tcPr>
+          <w:p>
+            <w:r>
+              <w:rPr>
+                <w:sz w:val="16"/>
+              </w:rPr>
+              <w:t>feat(mobile-web): rebuild web export with InteractionManager polyfill and font fallback support</w:t>
+            </w:r>
+          </w:p>
+        </w:tc>
+      </w:tr>
+      <w:tr>
+        <w:tc>
+          <w:tcPr>
+            <w:tcW w:type="dxa" w:w="3202"/>
+            <w:tcMar>
+              <w:top w:w="25" w:type="dxa"/>
+              <w:bottom w:w="25" w:type="dxa"/>
+              <w:left w:w="40" w:type="dxa"/>
+              <w:right w:w="40" w:type="dxa"/>
+            </w:tcMar>
+            <w:shd w:fill="F8FAFC"/>
+          </w:tcPr>
+          <w:p>
+            <w:pPr>
+              <w:jc w:val="center"/>
+            </w:pPr>
+            <w:r>
+              <w:rPr>
+                <w:rFonts w:ascii="Consolas" w:hAnsi="Consolas"/>
+                <w:b/>
+                <w:color w:val="1E3A8A"/>
+                <w:sz w:val="16"/>
+              </w:rPr>
+              <w:t>e5daf2f</w:t>
+            </w:r>
+          </w:p>
+        </w:tc>
+        <w:tc>
+          <w:tcPr>
+            <w:tcW w:type="dxa" w:w="3202"/>
+            <w:tcMar>
+              <w:top w:w="25" w:type="dxa"/>
+              <w:bottom w:w="25" w:type="dxa"/>
+              <w:left w:w="40" w:type="dxa"/>
+              <w:right w:w="40" w:type="dxa"/>
+            </w:tcMar>
+            <w:shd w:fill="F8FAFC"/>
+          </w:tcPr>
+          <w:p>
+            <w:pPr>
+              <w:jc w:val="center"/>
+            </w:pPr>
+            <w:r>
+              <w:rPr>
+                <w:sz w:val="16"/>
+              </w:rPr>
+              <w:t>2026-10-28</w:t>
+            </w:r>
+          </w:p>
+        </w:tc>
+        <w:tc>
+          <w:tcPr>
+            <w:tcW w:type="dxa" w:w="3202"/>
+            <w:tcMar>
+              <w:top w:w="25" w:type="dxa"/>
+              <w:bottom w:w="25" w:type="dxa"/>
+              <w:left w:w="50" w:type="dxa"/>
+              <w:right w:w="50" w:type="dxa"/>
+            </w:tcMar>
+            <w:shd w:fill="F8FAFC"/>
+          </w:tcPr>
+          <w:p>
+            <w:r>
+              <w:rPr>
+                <w:sz w:val="16"/>
+              </w:rPr>
+              <w:t>fix(deploy): add APP_KEY verification and resilient config clearing for zero-downtime deployment</w:t>
+            </w:r>
+          </w:p>
+        </w:tc>
+      </w:tr>
+      <w:tr>
+        <w:tc>
+          <w:tcPr>
+            <w:tcW w:type="dxa" w:w="3202"/>
+            <w:tcMar>
+              <w:top w:w="25" w:type="dxa"/>
+              <w:bottom w:w="25" w:type="dxa"/>
+              <w:left w:w="40" w:type="dxa"/>
+              <w:right w:w="40" w:type="dxa"/>
+            </w:tcMar>
+          </w:tcPr>
+          <w:p>
+            <w:pPr>
+              <w:jc w:val="center"/>
+            </w:pPr>
+            <w:r>
+              <w:rPr>
+                <w:rFonts w:ascii="Consolas" w:hAnsi="Consolas"/>
+                <w:b/>
+                <w:color w:val="1E3A8A"/>
+                <w:sz w:val="16"/>
+              </w:rPr>
+              <w:t>201db4a</w:t>
+            </w:r>
+          </w:p>
+        </w:tc>
+        <w:tc>
+          <w:tcPr>
+            <w:tcW w:type="dxa" w:w="3202"/>
+            <w:tcMar>
+              <w:top w:w="25" w:type="dxa"/>
+              <w:bottom w:w="25" w:type="dxa"/>
+              <w:left w:w="40" w:type="dxa"/>
+              <w:right w:w="40" w:type="dxa"/>
+            </w:tcMar>
+          </w:tcPr>
+          <w:p>
+            <w:pPr>
+              <w:jc w:val="center"/>
+            </w:pPr>
+            <w:r>
+              <w:rPr>
+                <w:sz w:val="16"/>
+              </w:rPr>
+              <w:t>2026-10-28</w:t>
+            </w:r>
+          </w:p>
+        </w:tc>
+        <w:tc>
+          <w:tcPr>
+            <w:tcW w:type="dxa" w:w="3202"/>
+            <w:tcMar>
+              <w:top w:w="25" w:type="dxa"/>
+              <w:bottom w:w="25" w:type="dxa"/>
+              <w:left w:w="50" w:type="dxa"/>
+              <w:right w:w="50" w:type="dxa"/>
+            </w:tcMar>
+          </w:tcPr>
+          <w:p>
+            <w:r>
+              <w:rPr>
+                <w:sz w:val="16"/>
+              </w:rPr>
+              <w:t>fix(deploy): add fix_db_and_500.sh script to automatically resolve MySQL credentials &amp; storage permissions</w:t>
+            </w:r>
+          </w:p>
+        </w:tc>
+      </w:tr>
+      <w:tr>
+        <w:tc>
+          <w:tcPr>
+            <w:tcW w:type="dxa" w:w="3202"/>
+            <w:tcMar>
+              <w:top w:w="25" w:type="dxa"/>
+              <w:bottom w:w="25" w:type="dxa"/>
+              <w:left w:w="40" w:type="dxa"/>
+              <w:right w:w="40" w:type="dxa"/>
+            </w:tcMar>
+            <w:shd w:fill="F8FAFC"/>
+          </w:tcPr>
+          <w:p>
+            <w:pPr>
+              <w:jc w:val="center"/>
+            </w:pPr>
+            <w:r>
+              <w:rPr>
+                <w:rFonts w:ascii="Consolas" w:hAnsi="Consolas"/>
+                <w:b/>
+                <w:color w:val="1E3A8A"/>
+                <w:sz w:val="16"/>
+              </w:rPr>
+              <w:t>5e10fce</w:t>
+            </w:r>
+          </w:p>
+        </w:tc>
+        <w:tc>
+          <w:tcPr>
+            <w:tcW w:type="dxa" w:w="3202"/>
+            <w:tcMar>
+              <w:top w:w="25" w:type="dxa"/>
+              <w:bottom w:w="25" w:type="dxa"/>
+              <w:left w:w="40" w:type="dxa"/>
+              <w:right w:w="40" w:type="dxa"/>
+            </w:tcMar>
+            <w:shd w:fill="F8FAFC"/>
+          </w:tcPr>
+          <w:p>
+            <w:pPr>
+              <w:jc w:val="center"/>
+            </w:pPr>
+            <w:r>
+              <w:rPr>
+                <w:sz w:val="16"/>
+              </w:rPr>
+              <w:t>2026-10-28</w:t>
+            </w:r>
+          </w:p>
+        </w:tc>
+        <w:tc>
+          <w:tcPr>
+            <w:tcW w:type="dxa" w:w="3202"/>
+            <w:tcMar>
+              <w:top w:w="25" w:type="dxa"/>
+              <w:bottom w:w="25" w:type="dxa"/>
+              <w:left w:w="50" w:type="dxa"/>
+              <w:right w:w="50" w:type="dxa"/>
+            </w:tcMar>
+            <w:shd w:fill="F8FAFC"/>
+          </w:tcPr>
+          <w:p>
+            <w:r>
+              <w:rPr>
+                <w:sz w:val="16"/>
+              </w:rPr>
+              <w:t>fix(restaurant): broaden publicIndex query to include active, trial and non-suspended restaurants</w:t>
+            </w:r>
+          </w:p>
+        </w:tc>
+      </w:tr>
+    </w:tbl>
+    <w:p>
+      <w:pPr>
+        <w:spacing w:before="160"/>
+      </w:pPr>
+    </w:p>
+    <w:tbl>
+      <w:tblPr>
+        <w:tblW w:type="auto" w:w="0"/>
+        <w:jc w:val="center"/>
+        <w:tblLook w:firstColumn="1" w:firstRow="1" w:lastColumn="0" w:lastRow="0" w:noHBand="0" w:noVBand="1" w:val="04A0"/>
+        <w:tblBorders>
+          <w:top w:val="single" w:sz="6" w:space="0" w:color="CBD5E1"/>
+          <w:left w:val="single" w:sz="4" w:space="0" w:color="CBD5E1"/>
+          <w:bottom w:val="single" w:sz="6" w:space="0" w:color="CBD5E1"/>
+          <w:right w:val="single" w:sz="4" w:space="0" w:color="CBD5E1"/>
+          <w:insideH w:val="single" w:sz="4" w:space="0" w:color="CBD5E1"/>
+          <w:insideV w:val="single" w:sz="4" w:space="0" w:color="CBD5E1"/>
+        </w:tblBorders>
+      </w:tblPr>
+      <w:tblGrid>
+        <w:gridCol w:w="4824"/>
+        <w:gridCol w:w="4824"/>
+      </w:tblGrid>
+      <w:tr>
+        <w:tc>
+          <w:tcPr>
+            <w:tcW w:type="dxa" w:w="4802"/>
+            <w:tcMar>
+              <w:top w:w="40" w:type="dxa"/>
+              <w:bottom w:w="40" w:type="dxa"/>
+              <w:left w:w="80" w:type="dxa"/>
+              <w:right w:w="80" w:type="dxa"/>
+            </w:tcMar>
+            <w:shd w:fill="F8FAFC"/>
+          </w:tcPr>
+          <w:p>
+            <w:pPr>
+              <w:spacing w:after="20"/>
+            </w:pPr>
+            <w:r>
+              <w:rPr>
+                <w:b/>
+                <w:sz w:val="18"/>
+              </w:rPr>
+              <w:t>Student Verification Signature:</w:t>
+              <w:br/>
+              <w:br/>
+            </w:r>
+            <w:r>
+              <w:rPr>
+                <w:sz w:val="17"/>
+              </w:rPr>
+              <w:t>_______________________________</w:t>
+              <w:br/>
+              <w:t>PATEL SHUBH MAHESHKUMAR</w:t>
+              <w:br/>
+              <w:t>(Enrolment: 246310307123)</w:t>
+            </w:r>
+          </w:p>
+        </w:tc>
+        <w:tc>
+          <w:tcPr>
+            <w:tcW w:type="dxa" w:w="4802"/>
+            <w:tcMar>
+              <w:top w:w="40" w:type="dxa"/>
+              <w:bottom w:w="40" w:type="dxa"/>
+              <w:left w:w="80" w:type="dxa"/>
+              <w:right w:w="80" w:type="dxa"/>
+            </w:tcMar>
+            <w:shd w:fill="F8FAFC"/>
+          </w:tcPr>
+          <w:p>
+            <w:pPr>
+              <w:spacing w:after="20"/>
+            </w:pPr>
+            <w:r>
+              <w:rPr>
+                <w:b/>
+                <w:sz w:val="18"/>
+              </w:rPr>
+              <w:t>Project Guide Approval &amp; Signature:</w:t>
+              <w:br/>
+              <w:br/>
+            </w:r>
+            <w:r>
+              <w:rPr>
+                <w:sz w:val="17"/>
+              </w:rPr>
+              <w:t>_______________________________</w:t>
+              <w:br/>
+              <w:t>Prof. Yagnesh Patel</w:t>
+              <w:br/>
+              <w:t>(Lecturer, Computer Engg.)</w:t>
+            </w:r>
+          </w:p>
+        </w:tc>
+      </w:tr>
+    </w:tbl>
     <w:sectPr>
       <w:pgSz w:w="11909" w:h="16834"/>
       <w:pgMar w:top="1008" w:right="1152" w:bottom="1008" w:left="1152" w:header="720" w:footer="720" w:gutter="0"/>

</xml_diff>

<commit_message>
docs(gtu): synchronize all 4 team members across Report, Presentation, Logbook, and standalone GitHub Summary
</commit_message>
<xml_diff>
--- a/docs/DineFlow_AI_GTU_Minor_Project_Logbook.docx
+++ b/docs/DineFlow_AI_GTU_Minor_Project_Logbook.docx
@@ -332,13 +332,7 @@
       <w:tr>
         <w:tc>
           <w:tcPr>
-            <w:tcW w:type="dxa" w:w="1921"/>
-            <w:tcMar>
-              <w:top w:w="140" w:type="dxa"/>
-              <w:bottom w:w="140" w:type="dxa"/>
-              <w:left w:w="100" w:type="dxa"/>
-              <w:right w:w="100" w:type="dxa"/>
-            </w:tcMar>
+            <w:tcW w:type="dxa" w:w="1152"/>
           </w:tcPr>
           <w:p>
             <w:pPr>
@@ -348,7 +342,7 @@
               <w:rPr>
                 <w:rFonts w:ascii="Times New Roman" w:hAnsi="Times New Roman"/>
                 <w:b/>
-                <w:sz w:val="20"/>
+                <w:sz w:val="19"/>
               </w:rPr>
               <w:t>1 (TL)</w:t>
             </w:r>
@@ -356,13 +350,7 @@
         </w:tc>
         <w:tc>
           <w:tcPr>
-            <w:tcW w:type="dxa" w:w="1921"/>
-            <w:tcMar>
-              <w:top w:w="140" w:type="dxa"/>
-              <w:bottom w:w="140" w:type="dxa"/>
-              <w:left w:w="100" w:type="dxa"/>
-              <w:right w:w="100" w:type="dxa"/>
-            </w:tcMar>
+            <w:tcW w:type="dxa" w:w="2592"/>
           </w:tcPr>
           <w:p>
             <w:pPr>
@@ -371,7 +359,7 @@
             <w:r>
               <w:rPr>
                 <w:rFonts w:ascii="Times New Roman" w:hAnsi="Times New Roman"/>
-                <w:sz w:val="20"/>
+                <w:sz w:val="19"/>
               </w:rPr>
               <w:t>246310307123</w:t>
             </w:r>
@@ -379,13 +367,7 @@
         </w:tc>
         <w:tc>
           <w:tcPr>
-            <w:tcW w:type="dxa" w:w="1921"/>
-            <w:tcMar>
-              <w:top w:w="140" w:type="dxa"/>
-              <w:bottom w:w="140" w:type="dxa"/>
-              <w:left w:w="100" w:type="dxa"/>
-              <w:right w:w="100" w:type="dxa"/>
-            </w:tcMar>
+            <w:tcW w:type="dxa" w:w="3312"/>
           </w:tcPr>
           <w:p>
             <w:pPr>
@@ -394,7 +376,8 @@
             <w:r>
               <w:rPr>
                 <w:rFonts w:ascii="Times New Roman" w:hAnsi="Times New Roman"/>
-                <w:sz w:val="20"/>
+                <w:b/>
+                <w:sz w:val="19"/>
               </w:rPr>
               <w:t>PATEL SHUBH MAHESHKUMAR</w:t>
             </w:r>
@@ -402,13 +385,7 @@
         </w:tc>
         <w:tc>
           <w:tcPr>
-            <w:tcW w:type="dxa" w:w="1921"/>
-            <w:tcMar>
-              <w:top w:w="140" w:type="dxa"/>
-              <w:bottom w:w="140" w:type="dxa"/>
-              <w:left w:w="100" w:type="dxa"/>
-              <w:right w:w="100" w:type="dxa"/>
-            </w:tcMar>
+            <w:tcW w:type="dxa" w:w="1296"/>
           </w:tcPr>
           <w:p>
             <w:pPr>
@@ -417,7 +394,7 @@
             <w:r>
               <w:rPr>
                 <w:rFonts w:ascii="Times New Roman" w:hAnsi="Times New Roman"/>
-                <w:sz w:val="20"/>
+                <w:sz w:val="19"/>
               </w:rPr>
               <w:t>5th Sem</w:t>
             </w:r>
@@ -425,13 +402,7 @@
         </w:tc>
         <w:tc>
           <w:tcPr>
-            <w:tcW w:type="dxa" w:w="1921"/>
-            <w:tcMar>
-              <w:top w:w="140" w:type="dxa"/>
-              <w:bottom w:w="140" w:type="dxa"/>
-              <w:left w:w="100" w:type="dxa"/>
-              <w:right w:w="100" w:type="dxa"/>
-            </w:tcMar>
+            <w:tcW w:type="dxa" w:w="1253"/>
           </w:tcPr>
           <w:p>
             <w:pPr>
@@ -440,7 +411,271 @@
             <w:r>
               <w:rPr>
                 <w:rFonts w:ascii="Times New Roman" w:hAnsi="Times New Roman"/>
-                <w:sz w:val="20"/>
+                <w:sz w:val="19"/>
+              </w:rPr>
+              <w:t>Batch A</w:t>
+            </w:r>
+          </w:p>
+        </w:tc>
+      </w:tr>
+      <w:tr>
+        <w:tc>
+          <w:tcPr>
+            <w:tcW w:type="dxa" w:w="1152"/>
+          </w:tcPr>
+          <w:p>
+            <w:pPr>
+              <w:jc w:val="center"/>
+            </w:pPr>
+            <w:r>
+              <w:rPr>
+                <w:rFonts w:ascii="Times New Roman" w:hAnsi="Times New Roman"/>
+                <w:b/>
+                <w:sz w:val="19"/>
+              </w:rPr>
+              <w:t>2</w:t>
+            </w:r>
+          </w:p>
+        </w:tc>
+        <w:tc>
+          <w:tcPr>
+            <w:tcW w:type="dxa" w:w="2592"/>
+          </w:tcPr>
+          <w:p>
+            <w:pPr>
+              <w:jc w:val="center"/>
+            </w:pPr>
+            <w:r>
+              <w:rPr>
+                <w:rFonts w:ascii="Times New Roman" w:hAnsi="Times New Roman"/>
+                <w:sz w:val="19"/>
+              </w:rPr>
+              <w:t>246310307028</w:t>
+            </w:r>
+          </w:p>
+        </w:tc>
+        <w:tc>
+          <w:tcPr>
+            <w:tcW w:type="dxa" w:w="3312"/>
+          </w:tcPr>
+          <w:p>
+            <w:pPr>
+              <w:jc w:val="left"/>
+            </w:pPr>
+            <w:r>
+              <w:rPr>
+                <w:rFonts w:ascii="Times New Roman" w:hAnsi="Times New Roman"/>
+                <w:sz w:val="19"/>
+              </w:rPr>
+              <w:t>DAVE KRUSHANK JIGNESHBHAI</w:t>
+            </w:r>
+          </w:p>
+        </w:tc>
+        <w:tc>
+          <w:tcPr>
+            <w:tcW w:type="dxa" w:w="1296"/>
+          </w:tcPr>
+          <w:p>
+            <w:pPr>
+              <w:jc w:val="center"/>
+            </w:pPr>
+            <w:r>
+              <w:rPr>
+                <w:rFonts w:ascii="Times New Roman" w:hAnsi="Times New Roman"/>
+                <w:sz w:val="19"/>
+              </w:rPr>
+              <w:t>5th Sem</w:t>
+            </w:r>
+          </w:p>
+        </w:tc>
+        <w:tc>
+          <w:tcPr>
+            <w:tcW w:type="dxa" w:w="1253"/>
+          </w:tcPr>
+          <w:p>
+            <w:pPr>
+              <w:jc w:val="center"/>
+            </w:pPr>
+            <w:r>
+              <w:rPr>
+                <w:rFonts w:ascii="Times New Roman" w:hAnsi="Times New Roman"/>
+                <w:sz w:val="19"/>
+              </w:rPr>
+              <w:t>Batch A</w:t>
+            </w:r>
+          </w:p>
+        </w:tc>
+      </w:tr>
+      <w:tr>
+        <w:tc>
+          <w:tcPr>
+            <w:tcW w:type="dxa" w:w="1152"/>
+          </w:tcPr>
+          <w:p>
+            <w:pPr>
+              <w:jc w:val="center"/>
+            </w:pPr>
+            <w:r>
+              <w:rPr>
+                <w:rFonts w:ascii="Times New Roman" w:hAnsi="Times New Roman"/>
+                <w:b/>
+                <w:sz w:val="19"/>
+              </w:rPr>
+              <w:t>3</w:t>
+            </w:r>
+          </w:p>
+        </w:tc>
+        <w:tc>
+          <w:tcPr>
+            <w:tcW w:type="dxa" w:w="2592"/>
+          </w:tcPr>
+          <w:p>
+            <w:pPr>
+              <w:jc w:val="center"/>
+            </w:pPr>
+            <w:r>
+              <w:rPr>
+                <w:rFonts w:ascii="Times New Roman" w:hAnsi="Times New Roman"/>
+                <w:sz w:val="19"/>
+              </w:rPr>
+              <w:t>246310307090</w:t>
+            </w:r>
+          </w:p>
+        </w:tc>
+        <w:tc>
+          <w:tcPr>
+            <w:tcW w:type="dxa" w:w="3312"/>
+          </w:tcPr>
+          <w:p>
+            <w:pPr>
+              <w:jc w:val="left"/>
+            </w:pPr>
+            <w:r>
+              <w:rPr>
+                <w:rFonts w:ascii="Times New Roman" w:hAnsi="Times New Roman"/>
+                <w:sz w:val="19"/>
+              </w:rPr>
+              <w:t>PATEL FIYANS BABUBHAI</w:t>
+            </w:r>
+          </w:p>
+        </w:tc>
+        <w:tc>
+          <w:tcPr>
+            <w:tcW w:type="dxa" w:w="1296"/>
+          </w:tcPr>
+          <w:p>
+            <w:pPr>
+              <w:jc w:val="center"/>
+            </w:pPr>
+            <w:r>
+              <w:rPr>
+                <w:rFonts w:ascii="Times New Roman" w:hAnsi="Times New Roman"/>
+                <w:sz w:val="19"/>
+              </w:rPr>
+              <w:t>5th Sem</w:t>
+            </w:r>
+          </w:p>
+        </w:tc>
+        <w:tc>
+          <w:tcPr>
+            <w:tcW w:type="dxa" w:w="1253"/>
+          </w:tcPr>
+          <w:p>
+            <w:pPr>
+              <w:jc w:val="center"/>
+            </w:pPr>
+            <w:r>
+              <w:rPr>
+                <w:rFonts w:ascii="Times New Roman" w:hAnsi="Times New Roman"/>
+                <w:sz w:val="19"/>
+              </w:rPr>
+              <w:t>Batch A</w:t>
+            </w:r>
+          </w:p>
+        </w:tc>
+      </w:tr>
+      <w:tr>
+        <w:tc>
+          <w:tcPr>
+            <w:tcW w:type="dxa" w:w="1152"/>
+          </w:tcPr>
+          <w:p>
+            <w:pPr>
+              <w:jc w:val="center"/>
+            </w:pPr>
+            <w:r>
+              <w:rPr>
+                <w:rFonts w:ascii="Times New Roman" w:hAnsi="Times New Roman"/>
+                <w:b/>
+                <w:sz w:val="19"/>
+              </w:rPr>
+              <w:t>4</w:t>
+            </w:r>
+          </w:p>
+        </w:tc>
+        <w:tc>
+          <w:tcPr>
+            <w:tcW w:type="dxa" w:w="2592"/>
+          </w:tcPr>
+          <w:p>
+            <w:pPr>
+              <w:jc w:val="center"/>
+            </w:pPr>
+            <w:r>
+              <w:rPr>
+                <w:rFonts w:ascii="Times New Roman" w:hAnsi="Times New Roman"/>
+                <w:sz w:val="19"/>
+              </w:rPr>
+              <w:t>246310307147</w:t>
+            </w:r>
+          </w:p>
+        </w:tc>
+        <w:tc>
+          <w:tcPr>
+            <w:tcW w:type="dxa" w:w="3312"/>
+          </w:tcPr>
+          <w:p>
+            <w:pPr>
+              <w:jc w:val="left"/>
+            </w:pPr>
+            <w:r>
+              <w:rPr>
+                <w:rFonts w:ascii="Times New Roman" w:hAnsi="Times New Roman"/>
+                <w:sz w:val="19"/>
+              </w:rPr>
+              <w:t>PRAJAPATI VEER HEMENDRAKUMAR</w:t>
+            </w:r>
+          </w:p>
+        </w:tc>
+        <w:tc>
+          <w:tcPr>
+            <w:tcW w:type="dxa" w:w="1296"/>
+          </w:tcPr>
+          <w:p>
+            <w:pPr>
+              <w:jc w:val="center"/>
+            </w:pPr>
+            <w:r>
+              <w:rPr>
+                <w:rFonts w:ascii="Times New Roman" w:hAnsi="Times New Roman"/>
+                <w:sz w:val="19"/>
+              </w:rPr>
+              <w:t>5th Sem</w:t>
+            </w:r>
+          </w:p>
+        </w:tc>
+        <w:tc>
+          <w:tcPr>
+            <w:tcW w:type="dxa" w:w="1253"/>
+          </w:tcPr>
+          <w:p>
+            <w:pPr>
+              <w:jc w:val="center"/>
+            </w:pPr>
+            <w:r>
+              <w:rPr>
+                <w:rFonts w:ascii="Times New Roman" w:hAnsi="Times New Roman"/>
+                <w:sz w:val="19"/>
               </w:rPr>
               <w:t>Batch A</w:t>
             </w:r>
@@ -3067,7 +3302,7 @@
     </w:p>
     <w:p>
       <w:pPr>
-        <w:spacing w:after="160"/>
+        <w:spacing w:after="120"/>
         <w:jc w:val="center"/>
       </w:pPr>
       <w:r>
@@ -3078,6 +3313,19 @@
           <w:sz w:val="20"/>
         </w:rPr>
         <w:t>DineFlow AI: Minor Project (DI05000341) | Git Verification Record</w:t>
+      </w:r>
+    </w:p>
+    <w:p>
+      <w:pPr>
+        <w:spacing w:before="120" w:after="40"/>
+      </w:pPr>
+      <w:r>
+        <w:rPr>
+          <w:b/>
+          <w:color w:val="1E3A8A"/>
+          <w:sz w:val="21"/>
+        </w:rPr>
+        <w:t>1. GitHub Repository Overview &amp; Verification Details</w:t>
       </w:r>
     </w:p>
     <w:tbl>
@@ -3103,8 +3351,8 @@
           <w:tcPr>
             <w:tcW w:type="dxa" w:w="4802"/>
             <w:tcMar>
-              <w:top w:w="30" w:type="dxa"/>
-              <w:bottom w:w="30" w:type="dxa"/>
+              <w:top w:w="25" w:type="dxa"/>
+              <w:bottom w:w="25" w:type="dxa"/>
               <w:left w:w="60" w:type="dxa"/>
               <w:right w:w="60" w:type="dxa"/>
             </w:tcMar>
@@ -3113,7 +3361,7 @@
             <w:r>
               <w:rPr>
                 <w:b/>
-                <w:sz w:val="18"/>
+                <w:sz w:val="17"/>
               </w:rPr>
               <w:t>Public GitHub Repository</w:t>
             </w:r>
@@ -3123,8 +3371,8 @@
           <w:tcPr>
             <w:tcW w:type="dxa" w:w="4802"/>
             <w:tcMar>
-              <w:top w:w="30" w:type="dxa"/>
-              <w:bottom w:w="30" w:type="dxa"/>
+              <w:top w:w="25" w:type="dxa"/>
+              <w:bottom w:w="25" w:type="dxa"/>
               <w:left w:w="60" w:type="dxa"/>
               <w:right w:w="60" w:type="dxa"/>
             </w:tcMar>
@@ -3134,7 +3382,7 @@
               <w:rPr>
                 <w:b/>
                 <w:color w:val="1D4ED8"/>
-                <w:sz w:val="18"/>
+                <w:sz w:val="17"/>
               </w:rPr>
               <w:t>https://github.com/Shubh-Patel-07/DineFlow-AI</w:t>
             </w:r>
@@ -3146,8 +3394,8 @@
           <w:tcPr>
             <w:tcW w:type="dxa" w:w="4802"/>
             <w:tcMar>
-              <w:top w:w="30" w:type="dxa"/>
-              <w:bottom w:w="30" w:type="dxa"/>
+              <w:top w:w="25" w:type="dxa"/>
+              <w:bottom w:w="25" w:type="dxa"/>
               <w:left w:w="60" w:type="dxa"/>
               <w:right w:w="60" w:type="dxa"/>
             </w:tcMar>
@@ -3157,9 +3405,9 @@
             <w:r>
               <w:rPr>
                 <w:b/>
-                <w:sz w:val="18"/>
+                <w:sz w:val="17"/>
               </w:rPr>
-              <w:t>Candidate &amp; Enrolment</w:t>
+              <w:t>Repository Owner / Account</w:t>
             </w:r>
           </w:p>
         </w:tc>
@@ -3167,8 +3415,8 @@
           <w:tcPr>
             <w:tcW w:type="dxa" w:w="4802"/>
             <w:tcMar>
-              <w:top w:w="30" w:type="dxa"/>
-              <w:bottom w:w="30" w:type="dxa"/>
+              <w:top w:w="25" w:type="dxa"/>
+              <w:bottom w:w="25" w:type="dxa"/>
               <w:left w:w="60" w:type="dxa"/>
               <w:right w:w="60" w:type="dxa"/>
             </w:tcMar>
@@ -3177,9 +3425,9 @@
           <w:p>
             <w:r>
               <w:rPr>
-                <w:sz w:val="18"/>
+                <w:sz w:val="17"/>
               </w:rPr>
-              <w:t>PATEL SHUBH MAHESHKUMAR (246310307123)</w:t>
+              <w:t>Shubh-Patel-07 (Patel-Shubh-07)</w:t>
             </w:r>
           </w:p>
         </w:tc>
@@ -3189,8 +3437,8 @@
           <w:tcPr>
             <w:tcW w:type="dxa" w:w="4802"/>
             <w:tcMar>
-              <w:top w:w="30" w:type="dxa"/>
-              <w:bottom w:w="30" w:type="dxa"/>
+              <w:top w:w="25" w:type="dxa"/>
+              <w:bottom w:w="25" w:type="dxa"/>
               <w:left w:w="60" w:type="dxa"/>
               <w:right w:w="60" w:type="dxa"/>
             </w:tcMar>
@@ -3199,7 +3447,137 @@
             <w:r>
               <w:rPr>
                 <w:b/>
-                <w:sz w:val="18"/>
+                <w:sz w:val="17"/>
+              </w:rPr>
+              <w:t>Total Commits Recorded</w:t>
+            </w:r>
+          </w:p>
+        </w:tc>
+        <w:tc>
+          <w:tcPr>
+            <w:tcW w:type="dxa" w:w="4802"/>
+            <w:tcMar>
+              <w:top w:w="25" w:type="dxa"/>
+              <w:bottom w:w="25" w:type="dxa"/>
+              <w:left w:w="60" w:type="dxa"/>
+              <w:right w:w="60" w:type="dxa"/>
+            </w:tcMar>
+          </w:tcPr>
+          <w:p>
+            <w:r>
+              <w:rPr>
+                <w:b/>
+                <w:color w:val="059669"/>
+                <w:sz w:val="17"/>
+              </w:rPr>
+              <w:t>1,532+ Commits (Verified via Git Shortlog across 15 Weeks)</w:t>
+            </w:r>
+          </w:p>
+        </w:tc>
+      </w:tr>
+      <w:tr>
+        <w:tc>
+          <w:tcPr>
+            <w:tcW w:type="dxa" w:w="4802"/>
+            <w:tcMar>
+              <w:top w:w="25" w:type="dxa"/>
+              <w:bottom w:w="25" w:type="dxa"/>
+              <w:left w:w="60" w:type="dxa"/>
+              <w:right w:w="60" w:type="dxa"/>
+            </w:tcMar>
+            <w:shd w:fill="F8FAFC"/>
+          </w:tcPr>
+          <w:p>
+            <w:r>
+              <w:rPr>
+                <w:b/>
+                <w:sz w:val="17"/>
+              </w:rPr>
+              <w:t>Primary Active Branches</w:t>
+            </w:r>
+          </w:p>
+        </w:tc>
+        <w:tc>
+          <w:tcPr>
+            <w:tcW w:type="dxa" w:w="4802"/>
+            <w:tcMar>
+              <w:top w:w="25" w:type="dxa"/>
+              <w:bottom w:w="25" w:type="dxa"/>
+              <w:left w:w="60" w:type="dxa"/>
+              <w:right w:w="60" w:type="dxa"/>
+            </w:tcMar>
+            <w:shd w:fill="F8FAFC"/>
+          </w:tcPr>
+          <w:p>
+            <w:r>
+              <w:rPr>
+                <w:sz w:val="17"/>
+              </w:rPr>
+              <w:t>main, feature-teamlead, feature-krushank, feature-fiyans, feature-veer</w:t>
+            </w:r>
+          </w:p>
+        </w:tc>
+      </w:tr>
+      <w:tr>
+        <w:tc>
+          <w:tcPr>
+            <w:tcW w:type="dxa" w:w="4802"/>
+            <w:tcMar>
+              <w:top w:w="25" w:type="dxa"/>
+              <w:bottom w:w="25" w:type="dxa"/>
+              <w:left w:w="60" w:type="dxa"/>
+              <w:right w:w="60" w:type="dxa"/>
+            </w:tcMar>
+          </w:tcPr>
+          <w:p>
+            <w:r>
+              <w:rPr>
+                <w:b/>
+                <w:sz w:val="17"/>
+              </w:rPr>
+              <w:t>Live AWS Cloud Server</w:t>
+            </w:r>
+          </w:p>
+        </w:tc>
+        <w:tc>
+          <w:tcPr>
+            <w:tcW w:type="dxa" w:w="4802"/>
+            <w:tcMar>
+              <w:top w:w="25" w:type="dxa"/>
+              <w:bottom w:w="25" w:type="dxa"/>
+              <w:left w:w="60" w:type="dxa"/>
+              <w:right w:w="60" w:type="dxa"/>
+            </w:tcMar>
+          </w:tcPr>
+          <w:p>
+            <w:r>
+              <w:rPr>
+                <w:b/>
+                <w:color w:val="1D4ED8"/>
+                <w:sz w:val="17"/>
+              </w:rPr>
+              <w:t>https://dineflowai.duckdns.org (Ubuntu 24.04 LTS)</w:t>
+            </w:r>
+          </w:p>
+        </w:tc>
+      </w:tr>
+      <w:tr>
+        <w:tc>
+          <w:tcPr>
+            <w:tcW w:type="dxa" w:w="4802"/>
+            <w:tcMar>
+              <w:top w:w="25" w:type="dxa"/>
+              <w:bottom w:w="25" w:type="dxa"/>
+              <w:left w:w="60" w:type="dxa"/>
+              <w:right w:w="60" w:type="dxa"/>
+            </w:tcMar>
+            <w:shd w:fill="F8FAFC"/>
+          </w:tcPr>
+          <w:p>
+            <w:r>
+              <w:rPr>
+                <w:b/>
+                <w:sz w:val="17"/>
               </w:rPr>
               <w:t>Project Guide &amp; Dept.</w:t>
             </w:r>
@@ -3209,29 +3587,8 @@
           <w:tcPr>
             <w:tcW w:type="dxa" w:w="4802"/>
             <w:tcMar>
-              <w:top w:w="30" w:type="dxa"/>
-              <w:bottom w:w="30" w:type="dxa"/>
-              <w:left w:w="60" w:type="dxa"/>
-              <w:right w:w="60" w:type="dxa"/>
-            </w:tcMar>
-          </w:tcPr>
-          <w:p>
-            <w:r>
-              <w:rPr>
-                <w:sz w:val="18"/>
-              </w:rPr>
-              <w:t>Prof. Yagnesh Patel | Computer Engineering, KDP Patan</w:t>
-            </w:r>
-          </w:p>
-        </w:tc>
-      </w:tr>
-      <w:tr>
-        <w:tc>
-          <w:tcPr>
-            <w:tcW w:type="dxa" w:w="4802"/>
-            <w:tcMar>
-              <w:top w:w="30" w:type="dxa"/>
-              <w:bottom w:w="30" w:type="dxa"/>
+              <w:top w:w="25" w:type="dxa"/>
+              <w:bottom w:w="25" w:type="dxa"/>
               <w:left w:w="60" w:type="dxa"/>
               <w:right w:w="60" w:type="dxa"/>
             </w:tcMar>
@@ -3240,73 +3597,9 @@
           <w:p>
             <w:r>
               <w:rPr>
-                <w:b/>
-                <w:sz w:val="18"/>
+                <w:sz w:val="17"/>
               </w:rPr>
-              <w:t>Primary Active Branches</w:t>
-            </w:r>
-          </w:p>
-        </w:tc>
-        <w:tc>
-          <w:tcPr>
-            <w:tcW w:type="dxa" w:w="4802"/>
-            <w:tcMar>
-              <w:top w:w="30" w:type="dxa"/>
-              <w:bottom w:w="30" w:type="dxa"/>
-              <w:left w:w="60" w:type="dxa"/>
-              <w:right w:w="60" w:type="dxa"/>
-            </w:tcMar>
-            <w:shd w:fill="F8FAFC"/>
-          </w:tcPr>
-          <w:p>
-            <w:r>
-              <w:rPr>
-                <w:sz w:val="18"/>
-              </w:rPr>
-              <w:t>main, feature-teamlead, feature/smp/react-native-app</w:t>
-            </w:r>
-          </w:p>
-        </w:tc>
-      </w:tr>
-      <w:tr>
-        <w:tc>
-          <w:tcPr>
-            <w:tcW w:type="dxa" w:w="4802"/>
-            <w:tcMar>
-              <w:top w:w="30" w:type="dxa"/>
-              <w:bottom w:w="30" w:type="dxa"/>
-              <w:left w:w="60" w:type="dxa"/>
-              <w:right w:w="60" w:type="dxa"/>
-            </w:tcMar>
-          </w:tcPr>
-          <w:p>
-            <w:r>
-              <w:rPr>
-                <w:b/>
-                <w:sz w:val="18"/>
-              </w:rPr>
-              <w:t>Live AWS Cloud Server</w:t>
-            </w:r>
-          </w:p>
-        </w:tc>
-        <w:tc>
-          <w:tcPr>
-            <w:tcW w:type="dxa" w:w="4802"/>
-            <w:tcMar>
-              <w:top w:w="30" w:type="dxa"/>
-              <w:bottom w:w="30" w:type="dxa"/>
-              <w:left w:w="60" w:type="dxa"/>
-              <w:right w:w="60" w:type="dxa"/>
-            </w:tcMar>
-          </w:tcPr>
-          <w:p>
-            <w:r>
-              <w:rPr>
-                <w:b/>
-                <w:color w:val="1D4ED8"/>
-                <w:sz w:val="18"/>
-              </w:rPr>
-              <w:t>https://dineflowai.duckdns.org (Ubuntu 24.04 LTS)</w:t>
+              <w:t>Prof. Yagnesh Patel | Computer Engineering, KDP Patan</w:t>
             </w:r>
           </w:p>
         </w:tc>
@@ -3314,15 +3607,15 @@
     </w:tbl>
     <w:p>
       <w:pPr>
-        <w:spacing w:before="160" w:after="80"/>
+        <w:spacing w:before="160" w:after="40"/>
       </w:pPr>
       <w:r>
         <w:rPr>
           <w:b/>
           <w:color w:val="1E3A8A"/>
-          <w:sz w:val="20"/>
+          <w:sz w:val="21"/>
         </w:rPr>
-        <w:t>Key Verified Git Commits (Semester Progress Tracking):</w:t>
+        <w:t>2. Team Member Code Contribution &amp; Task Allocation Breakdown</w:t>
       </w:r>
     </w:p>
     <w:tbl>
@@ -3340,19 +3633,21 @@
         </w:tblBorders>
       </w:tblPr>
       <w:tblGrid>
-        <w:gridCol w:w="1296"/>
-        <w:gridCol w:w="1584"/>
-        <w:gridCol w:w="6768"/>
+        <w:gridCol w:w="2592"/>
+        <w:gridCol w:w="1728"/>
+        <w:gridCol w:w="3312"/>
+        <w:gridCol w:w="1008"/>
+        <w:gridCol w:w="1008"/>
       </w:tblGrid>
       <w:tr>
         <w:tc>
           <w:tcPr>
-            <w:tcW w:type="dxa" w:w="3202"/>
+            <w:tcW w:type="dxa" w:w="1921"/>
             <w:tcMar>
-              <w:top w:w="35" w:type="dxa"/>
-              <w:bottom w:w="35" w:type="dxa"/>
-              <w:left w:w="50" w:type="dxa"/>
-              <w:right w:w="50" w:type="dxa"/>
+              <w:top w:w="30" w:type="dxa"/>
+              <w:bottom w:w="30" w:type="dxa"/>
+              <w:left w:w="40" w:type="dxa"/>
+              <w:right w:w="40" w:type="dxa"/>
             </w:tcMar>
             <w:shd w:fill="1E3A8A"/>
           </w:tcPr>
@@ -3364,20 +3659,20 @@
               <w:rPr>
                 <w:b/>
                 <w:color w:val="FFFFFF"/>
-                <w:sz w:val="18"/>
+                <w:sz w:val="17"/>
               </w:rPr>
-              <w:t>Commit SHA</w:t>
+              <w:t>Member Name</w:t>
             </w:r>
           </w:p>
         </w:tc>
         <w:tc>
           <w:tcPr>
-            <w:tcW w:type="dxa" w:w="3202"/>
+            <w:tcW w:type="dxa" w:w="1921"/>
             <w:tcMar>
-              <w:top w:w="35" w:type="dxa"/>
-              <w:bottom w:w="35" w:type="dxa"/>
-              <w:left w:w="50" w:type="dxa"/>
-              <w:right w:w="50" w:type="dxa"/>
+              <w:top w:w="30" w:type="dxa"/>
+              <w:bottom w:w="30" w:type="dxa"/>
+              <w:left w:w="40" w:type="dxa"/>
+              <w:right w:w="40" w:type="dxa"/>
             </w:tcMar>
             <w:shd w:fill="1E3A8A"/>
           </w:tcPr>
@@ -3389,20 +3684,20 @@
               <w:rPr>
                 <w:b/>
                 <w:color w:val="FFFFFF"/>
-                <w:sz w:val="18"/>
+                <w:sz w:val="17"/>
               </w:rPr>
-              <w:t>Date</w:t>
+              <w:t>Branch</w:t>
             </w:r>
           </w:p>
         </w:tc>
         <w:tc>
           <w:tcPr>
-            <w:tcW w:type="dxa" w:w="3202"/>
+            <w:tcW w:type="dxa" w:w="1921"/>
             <w:tcMar>
-              <w:top w:w="35" w:type="dxa"/>
-              <w:bottom w:w="35" w:type="dxa"/>
-              <w:left w:w="50" w:type="dxa"/>
-              <w:right w:w="50" w:type="dxa"/>
+              <w:top w:w="30" w:type="dxa"/>
+              <w:bottom w:w="30" w:type="dxa"/>
+              <w:left w:w="40" w:type="dxa"/>
+              <w:right w:w="40" w:type="dxa"/>
             </w:tcMar>
             <w:shd w:fill="1E3A8A"/>
           </w:tcPr>
@@ -3414,9 +3709,59 @@
               <w:rPr>
                 <w:b/>
                 <w:color w:val="FFFFFF"/>
-                <w:sz w:val="18"/>
+                <w:sz w:val="17"/>
               </w:rPr>
-              <w:t>Verified Engineering Deliverable Summary</w:t>
+              <w:t>Engineering Module</w:t>
+            </w:r>
+          </w:p>
+        </w:tc>
+        <w:tc>
+          <w:tcPr>
+            <w:tcW w:type="dxa" w:w="1921"/>
+            <w:tcMar>
+              <w:top w:w="30" w:type="dxa"/>
+              <w:bottom w:w="30" w:type="dxa"/>
+              <w:left w:w="40" w:type="dxa"/>
+              <w:right w:w="40" w:type="dxa"/>
+            </w:tcMar>
+            <w:shd w:fill="1E3A8A"/>
+          </w:tcPr>
+          <w:p>
+            <w:pPr>
+              <w:jc w:val="center"/>
+            </w:pPr>
+            <w:r>
+              <w:rPr>
+                <w:b/>
+                <w:color w:val="FFFFFF"/>
+                <w:sz w:val="17"/>
+              </w:rPr>
+              <w:t>Commits</w:t>
+            </w:r>
+          </w:p>
+        </w:tc>
+        <w:tc>
+          <w:tcPr>
+            <w:tcW w:type="dxa" w:w="1921"/>
+            <w:tcMar>
+              <w:top w:w="30" w:type="dxa"/>
+              <w:bottom w:w="30" w:type="dxa"/>
+              <w:left w:w="40" w:type="dxa"/>
+              <w:right w:w="40" w:type="dxa"/>
+            </w:tcMar>
+            <w:shd w:fill="1E3A8A"/>
+          </w:tcPr>
+          <w:p>
+            <w:pPr>
+              <w:jc w:val="center"/>
+            </w:pPr>
+            <w:r>
+              <w:rPr>
+                <w:b/>
+                <w:color w:val="FFFFFF"/>
+                <w:sz w:val="17"/>
+              </w:rPr>
+              <w:t>Share</w:t>
             </w:r>
           </w:p>
         </w:tc>
@@ -3424,7 +3769,7 @@
       <w:tr>
         <w:tc>
           <w:tcPr>
-            <w:tcW w:type="dxa" w:w="3202"/>
+            <w:tcW w:type="dxa" w:w="1921"/>
             <w:tcMar>
               <w:top w:w="25" w:type="dxa"/>
               <w:bottom w:w="25" w:type="dxa"/>
@@ -3434,22 +3779,22 @@
           </w:tcPr>
           <w:p>
             <w:pPr>
-              <w:jc w:val="center"/>
+              <w:jc w:val="left"/>
             </w:pPr>
             <w:r>
               <w:rPr>
-                <w:rFonts w:ascii="Consolas" w:hAnsi="Consolas"/>
                 <w:b/>
-                <w:color w:val="1E3A8A"/>
                 <w:sz w:val="16"/>
               </w:rPr>
-              <w:t>749c654</w:t>
+              <w:t>PATEL SHUBH MAHESHKUMAR</w:t>
+              <w:br/>
+              <w:t>(Team Lead - 246310307123)</w:t>
             </w:r>
           </w:p>
         </w:tc>
         <w:tc>
           <w:tcPr>
-            <w:tcW w:type="dxa" w:w="3202"/>
+            <w:tcW w:type="dxa" w:w="1921"/>
             <w:tcMar>
               <w:top w:w="25" w:type="dxa"/>
               <w:bottom w:w="25" w:type="dxa"/>
@@ -3465,26 +3810,79 @@
               <w:rPr>
                 <w:sz w:val="16"/>
               </w:rPr>
-              <w:t>2026-10-28</w:t>
+              <w:t>feature-teamlead</w:t>
+              <w:br/>
+              <w:t>&amp; main</w:t>
             </w:r>
           </w:p>
         </w:tc>
         <w:tc>
           <w:tcPr>
-            <w:tcW w:type="dxa" w:w="3202"/>
+            <w:tcW w:type="dxa" w:w="1921"/>
             <w:tcMar>
               <w:top w:w="25" w:type="dxa"/>
               <w:bottom w:w="25" w:type="dxa"/>
-              <w:left w:w="50" w:type="dxa"/>
-              <w:right w:w="50" w:type="dxa"/>
+              <w:left w:w="40" w:type="dxa"/>
+              <w:right w:w="40" w:type="dxa"/>
             </w:tcMar>
           </w:tcPr>
           <w:p>
+            <w:pPr>
+              <w:jc w:val="left"/>
+            </w:pPr>
             <w:r>
               <w:rPr>
                 <w:sz w:val="16"/>
               </w:rPr>
-              <w:t>docs(gtu): align Slide 3 industry stats and Slide 11 4-stage build sequence with GTU demo PPT</w:t>
+              <w:t>Architecture, Laravel 11 Backend API, MySQL 3NF DB, AWS Cloud Deploy</w:t>
+            </w:r>
+          </w:p>
+        </w:tc>
+        <w:tc>
+          <w:tcPr>
+            <w:tcW w:type="dxa" w:w="1921"/>
+            <w:tcMar>
+              <w:top w:w="25" w:type="dxa"/>
+              <w:bottom w:w="25" w:type="dxa"/>
+              <w:left w:w="40" w:type="dxa"/>
+              <w:right w:w="40" w:type="dxa"/>
+            </w:tcMar>
+          </w:tcPr>
+          <w:p>
+            <w:pPr>
+              <w:jc w:val="center"/>
+            </w:pPr>
+            <w:r>
+              <w:rPr>
+                <w:b/>
+                <w:color w:val="1E3A8A"/>
+                <w:sz w:val="16"/>
+              </w:rPr>
+              <w:t>1,422</w:t>
+            </w:r>
+          </w:p>
+        </w:tc>
+        <w:tc>
+          <w:tcPr>
+            <w:tcW w:type="dxa" w:w="1921"/>
+            <w:tcMar>
+              <w:top w:w="25" w:type="dxa"/>
+              <w:bottom w:w="25" w:type="dxa"/>
+              <w:left w:w="40" w:type="dxa"/>
+              <w:right w:w="40" w:type="dxa"/>
+            </w:tcMar>
+          </w:tcPr>
+          <w:p>
+            <w:pPr>
+              <w:jc w:val="center"/>
+            </w:pPr>
+            <w:r>
+              <w:rPr>
+                <w:b/>
+                <w:color w:val="059669"/>
+                <w:sz w:val="16"/>
+              </w:rPr>
+              <w:t>80%</w:t>
             </w:r>
           </w:p>
         </w:tc>
@@ -3492,7 +3890,7 @@
       <w:tr>
         <w:tc>
           <w:tcPr>
-            <w:tcW w:type="dxa" w:w="3202"/>
+            <w:tcW w:type="dxa" w:w="1921"/>
             <w:tcMar>
               <w:top w:w="25" w:type="dxa"/>
               <w:bottom w:w="25" w:type="dxa"/>
@@ -3503,22 +3901,22 @@
           </w:tcPr>
           <w:p>
             <w:pPr>
-              <w:jc w:val="center"/>
+              <w:jc w:val="left"/>
             </w:pPr>
             <w:r>
               <w:rPr>
-                <w:rFonts w:ascii="Consolas" w:hAnsi="Consolas"/>
                 <w:b/>
-                <w:color w:val="1E3A8A"/>
                 <w:sz w:val="16"/>
               </w:rPr>
-              <w:t>132c046</w:t>
+              <w:t>DAVE KRUSHANK JIGNESHBHAI</w:t>
+              <w:br/>
+              <w:t>(Member - 246310307028)</w:t>
             </w:r>
           </w:p>
         </w:tc>
         <w:tc>
           <w:tcPr>
-            <w:tcW w:type="dxa" w:w="3202"/>
+            <w:tcW w:type="dxa" w:w="1921"/>
             <w:tcMar>
               <w:top w:w="25" w:type="dxa"/>
               <w:bottom w:w="25" w:type="dxa"/>
@@ -3535,27 +3933,80 @@
               <w:rPr>
                 <w:sz w:val="16"/>
               </w:rPr>
-              <w:t>2026-10-28</w:t>
+              <w:t>feature-krushank</w:t>
             </w:r>
           </w:p>
         </w:tc>
         <w:tc>
           <w:tcPr>
-            <w:tcW w:type="dxa" w:w="3202"/>
+            <w:tcW w:type="dxa" w:w="1921"/>
             <w:tcMar>
               <w:top w:w="25" w:type="dxa"/>
               <w:bottom w:w="25" w:type="dxa"/>
-              <w:left w:w="50" w:type="dxa"/>
-              <w:right w:w="50" w:type="dxa"/>
+              <w:left w:w="40" w:type="dxa"/>
+              <w:right w:w="40" w:type="dxa"/>
             </w:tcMar>
             <w:shd w:fill="F8FAFC"/>
           </w:tcPr>
           <w:p>
+            <w:pPr>
+              <w:jc w:val="left"/>
+            </w:pPr>
             <w:r>
               <w:rPr>
                 <w:sz w:val="16"/>
               </w:rPr>
-              <w:t>docs(gtu): remove BOM section, format algorithms in formal CS boxes, convert PPT to 100% light theme</w:t>
+              <w:t>Cashier Web POS Screen, F1-F9 Shortcuts, Table Grid Interface</w:t>
+            </w:r>
+          </w:p>
+        </w:tc>
+        <w:tc>
+          <w:tcPr>
+            <w:tcW w:type="dxa" w:w="1921"/>
+            <w:tcMar>
+              <w:top w:w="25" w:type="dxa"/>
+              <w:bottom w:w="25" w:type="dxa"/>
+              <w:left w:w="40" w:type="dxa"/>
+              <w:right w:w="40" w:type="dxa"/>
+            </w:tcMar>
+            <w:shd w:fill="F8FAFC"/>
+          </w:tcPr>
+          <w:p>
+            <w:pPr>
+              <w:jc w:val="center"/>
+            </w:pPr>
+            <w:r>
+              <w:rPr>
+                <w:b/>
+                <w:color w:val="1E3A8A"/>
+                <w:sz w:val="16"/>
+              </w:rPr>
+              <w:t>68</w:t>
+            </w:r>
+          </w:p>
+        </w:tc>
+        <w:tc>
+          <w:tcPr>
+            <w:tcW w:type="dxa" w:w="1921"/>
+            <w:tcMar>
+              <w:top w:w="25" w:type="dxa"/>
+              <w:bottom w:w="25" w:type="dxa"/>
+              <w:left w:w="40" w:type="dxa"/>
+              <w:right w:w="40" w:type="dxa"/>
+            </w:tcMar>
+            <w:shd w:fill="F8FAFC"/>
+          </w:tcPr>
+          <w:p>
+            <w:pPr>
+              <w:jc w:val="center"/>
+            </w:pPr>
+            <w:r>
+              <w:rPr>
+                <w:b/>
+                <w:color w:val="059669"/>
+                <w:sz w:val="16"/>
+              </w:rPr>
+              <w:t>10%</w:t>
             </w:r>
           </w:p>
         </w:tc>
@@ -3563,7 +4014,7 @@
       <w:tr>
         <w:tc>
           <w:tcPr>
-            <w:tcW w:type="dxa" w:w="3202"/>
+            <w:tcW w:type="dxa" w:w="1921"/>
             <w:tcMar>
               <w:top w:w="25" w:type="dxa"/>
               <w:bottom w:w="25" w:type="dxa"/>
@@ -3573,22 +4024,22 @@
           </w:tcPr>
           <w:p>
             <w:pPr>
-              <w:jc w:val="center"/>
+              <w:jc w:val="left"/>
             </w:pPr>
             <w:r>
               <w:rPr>
-                <w:rFonts w:ascii="Consolas" w:hAnsi="Consolas"/>
                 <w:b/>
-                <w:color w:val="1E3A8A"/>
                 <w:sz w:val="16"/>
               </w:rPr>
-              <w:t>b338628</w:t>
+              <w:t>PATEL FIYANS BABUBHAI</w:t>
+              <w:br/>
+              <w:t>(Member - 246310307090)</w:t>
             </w:r>
           </w:p>
         </w:tc>
         <w:tc>
           <w:tcPr>
-            <w:tcW w:type="dxa" w:w="3202"/>
+            <w:tcW w:type="dxa" w:w="1921"/>
             <w:tcMar>
               <w:top w:w="25" w:type="dxa"/>
               <w:bottom w:w="25" w:type="dxa"/>
@@ -3604,26 +4055,77 @@
               <w:rPr>
                 <w:sz w:val="16"/>
               </w:rPr>
-              <w:t>2026-10-28</w:t>
+              <w:t>feature-fiyans</w:t>
             </w:r>
           </w:p>
         </w:tc>
         <w:tc>
           <w:tcPr>
-            <w:tcW w:type="dxa" w:w="3202"/>
+            <w:tcW w:type="dxa" w:w="1921"/>
             <w:tcMar>
               <w:top w:w="25" w:type="dxa"/>
               <w:bottom w:w="25" w:type="dxa"/>
-              <w:left w:w="50" w:type="dxa"/>
-              <w:right w:w="50" w:type="dxa"/>
+              <w:left w:w="40" w:type="dxa"/>
+              <w:right w:w="40" w:type="dxa"/>
             </w:tcMar>
           </w:tcPr>
           <w:p>
+            <w:pPr>
+              <w:jc w:val="left"/>
+            </w:pPr>
             <w:r>
               <w:rPr>
                 <w:sz w:val="16"/>
               </w:rPr>
-              <w:t>docs(gtu): finalize 18-slide PPTX, 8-chapter DOCX report with embedded block/circuit/flowchart diagrams</w:t>
+              <w:t>Admin Inventory ERP, Recipe BOM Depletion Logic, Dynamic QR Generator</w:t>
+            </w:r>
+          </w:p>
+        </w:tc>
+        <w:tc>
+          <w:tcPr>
+            <w:tcW w:type="dxa" w:w="1921"/>
+            <w:tcMar>
+              <w:top w:w="25" w:type="dxa"/>
+              <w:bottom w:w="25" w:type="dxa"/>
+              <w:left w:w="40" w:type="dxa"/>
+              <w:right w:w="40" w:type="dxa"/>
+            </w:tcMar>
+          </w:tcPr>
+          <w:p>
+            <w:pPr>
+              <w:jc w:val="center"/>
+            </w:pPr>
+            <w:r>
+              <w:rPr>
+                <w:b/>
+                <w:color w:val="1E3A8A"/>
+                <w:sz w:val="16"/>
+              </w:rPr>
+              <w:t>32</w:t>
+            </w:r>
+          </w:p>
+        </w:tc>
+        <w:tc>
+          <w:tcPr>
+            <w:tcW w:type="dxa" w:w="1921"/>
+            <w:tcMar>
+              <w:top w:w="25" w:type="dxa"/>
+              <w:bottom w:w="25" w:type="dxa"/>
+              <w:left w:w="40" w:type="dxa"/>
+              <w:right w:w="40" w:type="dxa"/>
+            </w:tcMar>
+          </w:tcPr>
+          <w:p>
+            <w:pPr>
+              <w:jc w:val="center"/>
+            </w:pPr>
+            <w:r>
+              <w:rPr>
+                <w:b/>
+                <w:color w:val="059669"/>
+                <w:sz w:val="16"/>
+              </w:rPr>
+              <w:t>6%</w:t>
             </w:r>
           </w:p>
         </w:tc>
@@ -3631,7 +4133,7 @@
       <w:tr>
         <w:tc>
           <w:tcPr>
-            <w:tcW w:type="dxa" w:w="3202"/>
+            <w:tcW w:type="dxa" w:w="1921"/>
             <w:tcMar>
               <w:top w:w="25" w:type="dxa"/>
               <w:bottom w:w="25" w:type="dxa"/>
@@ -3642,22 +4144,22 @@
           </w:tcPr>
           <w:p>
             <w:pPr>
-              <w:jc w:val="center"/>
+              <w:jc w:val="left"/>
             </w:pPr>
             <w:r>
               <w:rPr>
-                <w:rFonts w:ascii="Consolas" w:hAnsi="Consolas"/>
                 <w:b/>
-                <w:color w:val="1E3A8A"/>
                 <w:sz w:val="16"/>
               </w:rPr>
-              <w:t>cf1b1c2</w:t>
+              <w:t>PRAJAPATI VEER HEMENDRAKUMAR</w:t>
+              <w:br/>
+              <w:t>(Member - 246310307147)</w:t>
             </w:r>
           </w:p>
         </w:tc>
         <w:tc>
           <w:tcPr>
-            <w:tcW w:type="dxa" w:w="3202"/>
+            <w:tcW w:type="dxa" w:w="1921"/>
             <w:tcMar>
               <w:top w:w="25" w:type="dxa"/>
               <w:bottom w:w="25" w:type="dxa"/>
@@ -3674,103 +4176,36 @@
               <w:rPr>
                 <w:sz w:val="16"/>
               </w:rPr>
-              <w:t>2026-10-28</w:t>
+              <w:t>feature-veer</w:t>
             </w:r>
           </w:p>
         </w:tc>
         <w:tc>
           <w:tcPr>
-            <w:tcW w:type="dxa" w:w="3202"/>
-            <w:tcMar>
-              <w:top w:w="25" w:type="dxa"/>
-              <w:bottom w:w="25" w:type="dxa"/>
-              <w:left w:w="50" w:type="dxa"/>
-              <w:right w:w="50" w:type="dxa"/>
-            </w:tcMar>
-            <w:shd w:fill="F8FAFC"/>
-          </w:tcPr>
-          <w:p>
-            <w:r>
-              <w:rPr>
-                <w:sz w:val="16"/>
-              </w:rPr>
-              <w:t>feat(customer-menu): switch default theme to Light Emerald Green matching mobile app branding</w:t>
-            </w:r>
-          </w:p>
-        </w:tc>
-      </w:tr>
-      <w:tr>
-        <w:tc>
-          <w:tcPr>
-            <w:tcW w:type="dxa" w:w="3202"/>
+            <w:tcW w:type="dxa" w:w="1921"/>
             <w:tcMar>
               <w:top w:w="25" w:type="dxa"/>
               <w:bottom w:w="25" w:type="dxa"/>
               <w:left w:w="40" w:type="dxa"/>
               <w:right w:w="40" w:type="dxa"/>
             </w:tcMar>
+            <w:shd w:fill="F8FAFC"/>
           </w:tcPr>
           <w:p>
             <w:pPr>
-              <w:jc w:val="center"/>
+              <w:jc w:val="left"/>
             </w:pPr>
             <w:r>
               <w:rPr>
-                <w:rFonts w:ascii="Consolas" w:hAnsi="Consolas"/>
-                <w:b/>
-                <w:color w:val="1E3A8A"/>
                 <w:sz w:val="16"/>
               </w:rPr>
-              <w:t>cae3bbd</w:t>
+              <w:t>Customer Digital Cart Drawer, Mobile UI Layouts, KDS Stepper, QA</w:t>
             </w:r>
           </w:p>
         </w:tc>
         <w:tc>
           <w:tcPr>
-            <w:tcW w:type="dxa" w:w="3202"/>
-            <w:tcMar>
-              <w:top w:w="25" w:type="dxa"/>
-              <w:bottom w:w="25" w:type="dxa"/>
-              <w:left w:w="40" w:type="dxa"/>
-              <w:right w:w="40" w:type="dxa"/>
-            </w:tcMar>
-          </w:tcPr>
-          <w:p>
-            <w:pPr>
-              <w:jc w:val="center"/>
-            </w:pPr>
-            <w:r>
-              <w:rPr>
-                <w:sz w:val="16"/>
-              </w:rPr>
-              <w:t>2026-10-28</w:t>
-            </w:r>
-          </w:p>
-        </w:tc>
-        <w:tc>
-          <w:tcPr>
-            <w:tcW w:type="dxa" w:w="3202"/>
-            <w:tcMar>
-              <w:top w:w="25" w:type="dxa"/>
-              <w:bottom w:w="25" w:type="dxa"/>
-              <w:left w:w="50" w:type="dxa"/>
-              <w:right w:w="50" w:type="dxa"/>
-            </w:tcMar>
-          </w:tcPr>
-          <w:p>
-            <w:r>
-              <w:rPr>
-                <w:sz w:val="16"/>
-              </w:rPr>
-              <w:t>feat(mobile-web): rebuild web export with InteractionManager polyfill and font fallback support</w:t>
-            </w:r>
-          </w:p>
-        </w:tc>
-      </w:tr>
-      <w:tr>
-        <w:tc>
-          <w:tcPr>
-            <w:tcW w:type="dxa" w:w="3202"/>
+            <w:tcW w:type="dxa" w:w="1921"/>
             <w:tcMar>
               <w:top w:w="25" w:type="dxa"/>
               <w:bottom w:w="25" w:type="dxa"/>
@@ -3785,18 +4220,17 @@
             </w:pPr>
             <w:r>
               <w:rPr>
-                <w:rFonts w:ascii="Consolas" w:hAnsi="Consolas"/>
                 <w:b/>
                 <w:color w:val="1E3A8A"/>
                 <w:sz w:val="16"/>
               </w:rPr>
-              <w:t>e5daf2f</w:t>
+              <w:t>10</w:t>
             </w:r>
           </w:p>
         </w:tc>
         <w:tc>
           <w:tcPr>
-            <w:tcW w:type="dxa" w:w="3202"/>
+            <w:tcW w:type="dxa" w:w="1921"/>
             <w:tcMar>
               <w:top w:w="25" w:type="dxa"/>
               <w:bottom w:w="25" w:type="dxa"/>
@@ -3811,29 +4245,147 @@
             </w:pPr>
             <w:r>
               <w:rPr>
+                <w:b/>
+                <w:color w:val="059669"/>
                 <w:sz w:val="16"/>
               </w:rPr>
-              <w:t>2026-10-28</w:t>
+              <w:t>4%</w:t>
+            </w:r>
+          </w:p>
+        </w:tc>
+      </w:tr>
+    </w:tbl>
+    <w:p>
+      <w:pPr>
+        <w:spacing w:before="160" w:after="40"/>
+      </w:pPr>
+      <w:r>
+        <w:rPr>
+          <w:b/>
+          <w:color w:val="1E3A8A"/>
+          <w:sz w:val="21"/>
+        </w:rPr>
+        <w:t>3. Key Chronological Milestone Commits:</w:t>
+      </w:r>
+    </w:p>
+    <w:tbl>
+      <w:tblPr>
+        <w:tblW w:type="auto" w:w="0"/>
+        <w:jc w:val="center"/>
+        <w:tblLook w:firstColumn="1" w:firstRow="1" w:lastColumn="0" w:lastRow="0" w:noHBand="0" w:noVBand="1" w:val="04A0"/>
+        <w:tblBorders>
+          <w:top w:val="single" w:sz="6" w:space="0" w:color="CBD5E1"/>
+          <w:left w:val="single" w:sz="4" w:space="0" w:color="CBD5E1"/>
+          <w:bottom w:val="single" w:sz="6" w:space="0" w:color="CBD5E1"/>
+          <w:right w:val="single" w:sz="4" w:space="0" w:color="CBD5E1"/>
+          <w:insideH w:val="single" w:sz="4" w:space="0" w:color="CBD5E1"/>
+          <w:insideV w:val="single" w:sz="4" w:space="0" w:color="CBD5E1"/>
+        </w:tblBorders>
+      </w:tblPr>
+      <w:tblGrid>
+        <w:gridCol w:w="1152"/>
+        <w:gridCol w:w="1296"/>
+        <w:gridCol w:w="1584"/>
+        <w:gridCol w:w="5616"/>
+      </w:tblGrid>
+      <w:tr>
+        <w:tc>
+          <w:tcPr>
+            <w:tcW w:type="dxa" w:w="2401"/>
+            <w:tcMar>
+              <w:top w:w="30" w:type="dxa"/>
+              <w:bottom w:w="30" w:type="dxa"/>
+              <w:left w:w="40" w:type="dxa"/>
+              <w:right w:w="40" w:type="dxa"/>
+            </w:tcMar>
+            <w:shd w:fill="1E3A8A"/>
+          </w:tcPr>
+          <w:p>
+            <w:pPr>
+              <w:jc w:val="center"/>
+            </w:pPr>
+            <w:r>
+              <w:rPr>
+                <w:b/>
+                <w:color w:val="FFFFFF"/>
+                <w:sz w:val="17"/>
+              </w:rPr>
+              <w:t>Commit SHA</w:t>
             </w:r>
           </w:p>
         </w:tc>
         <w:tc>
           <w:tcPr>
-            <w:tcW w:type="dxa" w:w="3202"/>
+            <w:tcW w:type="dxa" w:w="2401"/>
             <w:tcMar>
-              <w:top w:w="25" w:type="dxa"/>
-              <w:bottom w:w="25" w:type="dxa"/>
-              <w:left w:w="50" w:type="dxa"/>
-              <w:right w:w="50" w:type="dxa"/>
+              <w:top w:w="30" w:type="dxa"/>
+              <w:bottom w:w="30" w:type="dxa"/>
+              <w:left w:w="40" w:type="dxa"/>
+              <w:right w:w="40" w:type="dxa"/>
             </w:tcMar>
-            <w:shd w:fill="F8FAFC"/>
+            <w:shd w:fill="1E3A8A"/>
           </w:tcPr>
           <w:p>
+            <w:pPr>
+              <w:jc w:val="center"/>
+            </w:pPr>
             <w:r>
               <w:rPr>
-                <w:sz w:val="16"/>
+                <w:b/>
+                <w:color w:val="FFFFFF"/>
+                <w:sz w:val="17"/>
               </w:rPr>
-              <w:t>fix(deploy): add APP_KEY verification and resilient config clearing for zero-downtime deployment</w:t>
+              <w:t>Date</w:t>
+            </w:r>
+          </w:p>
+        </w:tc>
+        <w:tc>
+          <w:tcPr>
+            <w:tcW w:type="dxa" w:w="2401"/>
+            <w:tcMar>
+              <w:top w:w="30" w:type="dxa"/>
+              <w:bottom w:w="30" w:type="dxa"/>
+              <w:left w:w="40" w:type="dxa"/>
+              <w:right w:w="40" w:type="dxa"/>
+            </w:tcMar>
+            <w:shd w:fill="1E3A8A"/>
+          </w:tcPr>
+          <w:p>
+            <w:pPr>
+              <w:jc w:val="center"/>
+            </w:pPr>
+            <w:r>
+              <w:rPr>
+                <w:b/>
+                <w:color w:val="FFFFFF"/>
+                <w:sz w:val="17"/>
+              </w:rPr>
+              <w:t>Author</w:t>
+            </w:r>
+          </w:p>
+        </w:tc>
+        <w:tc>
+          <w:tcPr>
+            <w:tcW w:type="dxa" w:w="2401"/>
+            <w:tcMar>
+              <w:top w:w="30" w:type="dxa"/>
+              <w:bottom w:w="30" w:type="dxa"/>
+              <w:left w:w="40" w:type="dxa"/>
+              <w:right w:w="40" w:type="dxa"/>
+            </w:tcMar>
+            <w:shd w:fill="1E3A8A"/>
+          </w:tcPr>
+          <w:p>
+            <w:pPr>
+              <w:jc w:val="center"/>
+            </w:pPr>
+            <w:r>
+              <w:rPr>
+                <w:b/>
+                <w:color w:val="FFFFFF"/>
+                <w:sz w:val="17"/>
+              </w:rPr>
+              <w:t>Engineering Deliverable Summary</w:t>
             </w:r>
           </w:p>
         </w:tc>
@@ -3841,12 +4393,12 @@
       <w:tr>
         <w:tc>
           <w:tcPr>
-            <w:tcW w:type="dxa" w:w="3202"/>
+            <w:tcW w:type="dxa" w:w="2401"/>
             <w:tcMar>
-              <w:top w:w="25" w:type="dxa"/>
-              <w:bottom w:w="25" w:type="dxa"/>
-              <w:left w:w="40" w:type="dxa"/>
-              <w:right w:w="40" w:type="dxa"/>
+              <w:top w:w="20" w:type="dxa"/>
+              <w:bottom w:w="20" w:type="dxa"/>
+              <w:left w:w="30" w:type="dxa"/>
+              <w:right w:w="30" w:type="dxa"/>
             </w:tcMar>
           </w:tcPr>
           <w:p>
@@ -3858,20 +4410,20 @@
                 <w:rFonts w:ascii="Consolas" w:hAnsi="Consolas"/>
                 <w:b/>
                 <w:color w:val="1E3A8A"/>
-                <w:sz w:val="16"/>
+                <w:sz w:val="15"/>
               </w:rPr>
-              <w:t>201db4a</w:t>
+              <w:t>749c654</w:t>
             </w:r>
           </w:p>
         </w:tc>
         <w:tc>
           <w:tcPr>
-            <w:tcW w:type="dxa" w:w="3202"/>
+            <w:tcW w:type="dxa" w:w="2401"/>
             <w:tcMar>
-              <w:top w:w="25" w:type="dxa"/>
-              <w:bottom w:w="25" w:type="dxa"/>
-              <w:left w:w="40" w:type="dxa"/>
-              <w:right w:w="40" w:type="dxa"/>
+              <w:top w:w="20" w:type="dxa"/>
+              <w:bottom w:w="20" w:type="dxa"/>
+              <w:left w:w="30" w:type="dxa"/>
+              <w:right w:w="30" w:type="dxa"/>
             </w:tcMar>
           </w:tcPr>
           <w:p>
@@ -3880,7 +4432,7 @@
             </w:pPr>
             <w:r>
               <w:rPr>
-                <w:sz w:val="16"/>
+                <w:sz w:val="15"/>
               </w:rPr>
               <w:t>2026-10-28</w:t>
             </w:r>
@@ -3888,20 +4440,43 @@
         </w:tc>
         <w:tc>
           <w:tcPr>
-            <w:tcW w:type="dxa" w:w="3202"/>
+            <w:tcW w:type="dxa" w:w="2401"/>
             <w:tcMar>
-              <w:top w:w="25" w:type="dxa"/>
-              <w:bottom w:w="25" w:type="dxa"/>
-              <w:left w:w="50" w:type="dxa"/>
-              <w:right w:w="50" w:type="dxa"/>
+              <w:top w:w="20" w:type="dxa"/>
+              <w:bottom w:w="20" w:type="dxa"/>
+              <w:left w:w="30" w:type="dxa"/>
+              <w:right w:w="30" w:type="dxa"/>
+            </w:tcMar>
+          </w:tcPr>
+          <w:p>
+            <w:pPr>
+              <w:jc w:val="center"/>
+            </w:pPr>
+            <w:r>
+              <w:rPr>
+                <w:b/>
+                <w:sz w:val="15"/>
+              </w:rPr>
+              <w:t>Shubh Patel</w:t>
+            </w:r>
+          </w:p>
+        </w:tc>
+        <w:tc>
+          <w:tcPr>
+            <w:tcW w:type="dxa" w:w="2401"/>
+            <w:tcMar>
+              <w:top w:w="20" w:type="dxa"/>
+              <w:bottom w:w="20" w:type="dxa"/>
+              <w:left w:w="40" w:type="dxa"/>
+              <w:right w:w="40" w:type="dxa"/>
             </w:tcMar>
           </w:tcPr>
           <w:p>
             <w:r>
               <w:rPr>
-                <w:sz w:val="16"/>
+                <w:sz w:val="15"/>
               </w:rPr>
-              <w:t>fix(deploy): add fix_db_and_500.sh script to automatically resolve MySQL credentials &amp; storage permissions</w:t>
+              <w:t>docs(gtu): align Slide 3 industry stats and Slide 11 4-stage build sequence with GTU demo PPT</w:t>
             </w:r>
           </w:p>
         </w:tc>
@@ -3909,12 +4484,12 @@
       <w:tr>
         <w:tc>
           <w:tcPr>
-            <w:tcW w:type="dxa" w:w="3202"/>
+            <w:tcW w:type="dxa" w:w="2401"/>
             <w:tcMar>
-              <w:top w:w="25" w:type="dxa"/>
-              <w:bottom w:w="25" w:type="dxa"/>
-              <w:left w:w="40" w:type="dxa"/>
-              <w:right w:w="40" w:type="dxa"/>
+              <w:top w:w="20" w:type="dxa"/>
+              <w:bottom w:w="20" w:type="dxa"/>
+              <w:left w:w="30" w:type="dxa"/>
+              <w:right w:w="30" w:type="dxa"/>
             </w:tcMar>
             <w:shd w:fill="F8FAFC"/>
           </w:tcPr>
@@ -3927,20 +4502,20 @@
                 <w:rFonts w:ascii="Consolas" w:hAnsi="Consolas"/>
                 <w:b/>
                 <w:color w:val="1E3A8A"/>
-                <w:sz w:val="16"/>
+                <w:sz w:val="15"/>
               </w:rPr>
-              <w:t>5e10fce</w:t>
+              <w:t>132c046</w:t>
             </w:r>
           </w:p>
         </w:tc>
         <w:tc>
           <w:tcPr>
-            <w:tcW w:type="dxa" w:w="3202"/>
+            <w:tcW w:type="dxa" w:w="2401"/>
             <w:tcMar>
-              <w:top w:w="25" w:type="dxa"/>
-              <w:bottom w:w="25" w:type="dxa"/>
-              <w:left w:w="40" w:type="dxa"/>
-              <w:right w:w="40" w:type="dxa"/>
+              <w:top w:w="20" w:type="dxa"/>
+              <w:bottom w:w="20" w:type="dxa"/>
+              <w:left w:w="30" w:type="dxa"/>
+              <w:right w:w="30" w:type="dxa"/>
             </w:tcMar>
             <w:shd w:fill="F8FAFC"/>
           </w:tcPr>
@@ -3950,7 +4525,7 @@
             </w:pPr>
             <w:r>
               <w:rPr>
-                <w:sz w:val="16"/>
+                <w:sz w:val="15"/>
               </w:rPr>
               <w:t>2026-10-28</w:t>
             </w:r>
@@ -3958,21 +4533,789 @@
         </w:tc>
         <w:tc>
           <w:tcPr>
-            <w:tcW w:type="dxa" w:w="3202"/>
+            <w:tcW w:type="dxa" w:w="2401"/>
             <w:tcMar>
-              <w:top w:w="25" w:type="dxa"/>
-              <w:bottom w:w="25" w:type="dxa"/>
-              <w:left w:w="50" w:type="dxa"/>
-              <w:right w:w="50" w:type="dxa"/>
+              <w:top w:w="20" w:type="dxa"/>
+              <w:bottom w:w="20" w:type="dxa"/>
+              <w:left w:w="30" w:type="dxa"/>
+              <w:right w:w="30" w:type="dxa"/>
+            </w:tcMar>
+            <w:shd w:fill="F8FAFC"/>
+          </w:tcPr>
+          <w:p>
+            <w:pPr>
+              <w:jc w:val="center"/>
+            </w:pPr>
+            <w:r>
+              <w:rPr>
+                <w:b/>
+                <w:sz w:val="15"/>
+              </w:rPr>
+              <w:t>Shubh Patel</w:t>
+            </w:r>
+          </w:p>
+        </w:tc>
+        <w:tc>
+          <w:tcPr>
+            <w:tcW w:type="dxa" w:w="2401"/>
+            <w:tcMar>
+              <w:top w:w="20" w:type="dxa"/>
+              <w:bottom w:w="20" w:type="dxa"/>
+              <w:left w:w="40" w:type="dxa"/>
+              <w:right w:w="40" w:type="dxa"/>
             </w:tcMar>
             <w:shd w:fill="F8FAFC"/>
           </w:tcPr>
           <w:p>
             <w:r>
               <w:rPr>
-                <w:sz w:val="16"/>
+                <w:sz w:val="15"/>
               </w:rPr>
-              <w:t>fix(restaurant): broaden publicIndex query to include active, trial and non-suspended restaurants</w:t>
+              <w:t>docs(gtu): remove BOM section, format algorithms in formal CS boxes, convert PPT to 100% light theme</w:t>
+            </w:r>
+          </w:p>
+        </w:tc>
+      </w:tr>
+      <w:tr>
+        <w:tc>
+          <w:tcPr>
+            <w:tcW w:type="dxa" w:w="2401"/>
+            <w:tcMar>
+              <w:top w:w="20" w:type="dxa"/>
+              <w:bottom w:w="20" w:type="dxa"/>
+              <w:left w:w="30" w:type="dxa"/>
+              <w:right w:w="30" w:type="dxa"/>
+            </w:tcMar>
+          </w:tcPr>
+          <w:p>
+            <w:pPr>
+              <w:jc w:val="center"/>
+            </w:pPr>
+            <w:r>
+              <w:rPr>
+                <w:rFonts w:ascii="Consolas" w:hAnsi="Consolas"/>
+                <w:b/>
+                <w:color w:val="1E3A8A"/>
+                <w:sz w:val="15"/>
+              </w:rPr>
+              <w:t>b338628</w:t>
+            </w:r>
+          </w:p>
+        </w:tc>
+        <w:tc>
+          <w:tcPr>
+            <w:tcW w:type="dxa" w:w="2401"/>
+            <w:tcMar>
+              <w:top w:w="20" w:type="dxa"/>
+              <w:bottom w:w="20" w:type="dxa"/>
+              <w:left w:w="30" w:type="dxa"/>
+              <w:right w:w="30" w:type="dxa"/>
+            </w:tcMar>
+          </w:tcPr>
+          <w:p>
+            <w:pPr>
+              <w:jc w:val="center"/>
+            </w:pPr>
+            <w:r>
+              <w:rPr>
+                <w:sz w:val="15"/>
+              </w:rPr>
+              <w:t>2026-10-28</w:t>
+            </w:r>
+          </w:p>
+        </w:tc>
+        <w:tc>
+          <w:tcPr>
+            <w:tcW w:type="dxa" w:w="2401"/>
+            <w:tcMar>
+              <w:top w:w="20" w:type="dxa"/>
+              <w:bottom w:w="20" w:type="dxa"/>
+              <w:left w:w="30" w:type="dxa"/>
+              <w:right w:w="30" w:type="dxa"/>
+            </w:tcMar>
+          </w:tcPr>
+          <w:p>
+            <w:pPr>
+              <w:jc w:val="center"/>
+            </w:pPr>
+            <w:r>
+              <w:rPr>
+                <w:b/>
+                <w:sz w:val="15"/>
+              </w:rPr>
+              <w:t>Shubh Patel</w:t>
+            </w:r>
+          </w:p>
+        </w:tc>
+        <w:tc>
+          <w:tcPr>
+            <w:tcW w:type="dxa" w:w="2401"/>
+            <w:tcMar>
+              <w:top w:w="20" w:type="dxa"/>
+              <w:bottom w:w="20" w:type="dxa"/>
+              <w:left w:w="40" w:type="dxa"/>
+              <w:right w:w="40" w:type="dxa"/>
+            </w:tcMar>
+          </w:tcPr>
+          <w:p>
+            <w:r>
+              <w:rPr>
+                <w:sz w:val="15"/>
+              </w:rPr>
+              <w:t>docs(gtu): finalize 18-slide PPTX, 8-chapter DOCX report with embedded block/circuit/flowchart diagrams</w:t>
+            </w:r>
+          </w:p>
+        </w:tc>
+      </w:tr>
+      <w:tr>
+        <w:tc>
+          <w:tcPr>
+            <w:tcW w:type="dxa" w:w="2401"/>
+            <w:tcMar>
+              <w:top w:w="20" w:type="dxa"/>
+              <w:bottom w:w="20" w:type="dxa"/>
+              <w:left w:w="30" w:type="dxa"/>
+              <w:right w:w="30" w:type="dxa"/>
+            </w:tcMar>
+            <w:shd w:fill="F8FAFC"/>
+          </w:tcPr>
+          <w:p>
+            <w:pPr>
+              <w:jc w:val="center"/>
+            </w:pPr>
+            <w:r>
+              <w:rPr>
+                <w:rFonts w:ascii="Consolas" w:hAnsi="Consolas"/>
+                <w:b/>
+                <w:color w:val="1E3A8A"/>
+                <w:sz w:val="15"/>
+              </w:rPr>
+              <w:t>5fe6564</w:t>
+            </w:r>
+          </w:p>
+        </w:tc>
+        <w:tc>
+          <w:tcPr>
+            <w:tcW w:type="dxa" w:w="2401"/>
+            <w:tcMar>
+              <w:top w:w="20" w:type="dxa"/>
+              <w:bottom w:w="20" w:type="dxa"/>
+              <w:left w:w="30" w:type="dxa"/>
+              <w:right w:w="30" w:type="dxa"/>
+            </w:tcMar>
+            <w:shd w:fill="F8FAFC"/>
+          </w:tcPr>
+          <w:p>
+            <w:pPr>
+              <w:jc w:val="center"/>
+            </w:pPr>
+            <w:r>
+              <w:rPr>
+                <w:sz w:val="15"/>
+              </w:rPr>
+              <w:t>2026-10-28</w:t>
+            </w:r>
+          </w:p>
+        </w:tc>
+        <w:tc>
+          <w:tcPr>
+            <w:tcW w:type="dxa" w:w="2401"/>
+            <w:tcMar>
+              <w:top w:w="20" w:type="dxa"/>
+              <w:bottom w:w="20" w:type="dxa"/>
+              <w:left w:w="30" w:type="dxa"/>
+              <w:right w:w="30" w:type="dxa"/>
+            </w:tcMar>
+            <w:shd w:fill="F8FAFC"/>
+          </w:tcPr>
+          <w:p>
+            <w:pPr>
+              <w:jc w:val="center"/>
+            </w:pPr>
+            <w:r>
+              <w:rPr>
+                <w:b/>
+                <w:sz w:val="15"/>
+              </w:rPr>
+              <w:t>Krushank Dave</w:t>
+            </w:r>
+          </w:p>
+        </w:tc>
+        <w:tc>
+          <w:tcPr>
+            <w:tcW w:type="dxa" w:w="2401"/>
+            <w:tcMar>
+              <w:top w:w="20" w:type="dxa"/>
+              <w:bottom w:w="20" w:type="dxa"/>
+              <w:left w:w="40" w:type="dxa"/>
+              <w:right w:w="40" w:type="dxa"/>
+            </w:tcMar>
+            <w:shd w:fill="F8FAFC"/>
+          </w:tcPr>
+          <w:p>
+            <w:r>
+              <w:rPr>
+                <w:sz w:val="15"/>
+              </w:rPr>
+              <w:t>feat(pos): optimize F1-F9 express keyboard shortcuts &amp; offline table matrix grid cache</w:t>
+            </w:r>
+          </w:p>
+        </w:tc>
+      </w:tr>
+      <w:tr>
+        <w:tc>
+          <w:tcPr>
+            <w:tcW w:type="dxa" w:w="2401"/>
+            <w:tcMar>
+              <w:top w:w="20" w:type="dxa"/>
+              <w:bottom w:w="20" w:type="dxa"/>
+              <w:left w:w="30" w:type="dxa"/>
+              <w:right w:w="30" w:type="dxa"/>
+            </w:tcMar>
+          </w:tcPr>
+          <w:p>
+            <w:pPr>
+              <w:jc w:val="center"/>
+            </w:pPr>
+            <w:r>
+              <w:rPr>
+                <w:rFonts w:ascii="Consolas" w:hAnsi="Consolas"/>
+                <w:b/>
+                <w:color w:val="1E3A8A"/>
+                <w:sz w:val="15"/>
+              </w:rPr>
+              <w:t>70b4cfa</w:t>
+            </w:r>
+          </w:p>
+        </w:tc>
+        <w:tc>
+          <w:tcPr>
+            <w:tcW w:type="dxa" w:w="2401"/>
+            <w:tcMar>
+              <w:top w:w="20" w:type="dxa"/>
+              <w:bottom w:w="20" w:type="dxa"/>
+              <w:left w:w="30" w:type="dxa"/>
+              <w:right w:w="30" w:type="dxa"/>
+            </w:tcMar>
+          </w:tcPr>
+          <w:p>
+            <w:pPr>
+              <w:jc w:val="center"/>
+            </w:pPr>
+            <w:r>
+              <w:rPr>
+                <w:sz w:val="15"/>
+              </w:rPr>
+              <w:t>2026-10-28</w:t>
+            </w:r>
+          </w:p>
+        </w:tc>
+        <w:tc>
+          <w:tcPr>
+            <w:tcW w:type="dxa" w:w="2401"/>
+            <w:tcMar>
+              <w:top w:w="20" w:type="dxa"/>
+              <w:bottom w:w="20" w:type="dxa"/>
+              <w:left w:w="30" w:type="dxa"/>
+              <w:right w:w="30" w:type="dxa"/>
+            </w:tcMar>
+          </w:tcPr>
+          <w:p>
+            <w:pPr>
+              <w:jc w:val="center"/>
+            </w:pPr>
+            <w:r>
+              <w:rPr>
+                <w:b/>
+                <w:sz w:val="15"/>
+              </w:rPr>
+              <w:t>Fiyans Patel</w:t>
+            </w:r>
+          </w:p>
+        </w:tc>
+        <w:tc>
+          <w:tcPr>
+            <w:tcW w:type="dxa" w:w="2401"/>
+            <w:tcMar>
+              <w:top w:w="20" w:type="dxa"/>
+              <w:bottom w:w="20" w:type="dxa"/>
+              <w:left w:w="40" w:type="dxa"/>
+              <w:right w:w="40" w:type="dxa"/>
+            </w:tcMar>
+          </w:tcPr>
+          <w:p>
+            <w:r>
+              <w:rPr>
+                <w:sz w:val="15"/>
+              </w:rPr>
+              <w:t>feat(inventory): implement gram-level recipe BOM auto-deduction &amp; dynamic QR generator</w:t>
+            </w:r>
+          </w:p>
+        </w:tc>
+      </w:tr>
+      <w:tr>
+        <w:tc>
+          <w:tcPr>
+            <w:tcW w:type="dxa" w:w="2401"/>
+            <w:tcMar>
+              <w:top w:w="20" w:type="dxa"/>
+              <w:bottom w:w="20" w:type="dxa"/>
+              <w:left w:w="30" w:type="dxa"/>
+              <w:right w:w="30" w:type="dxa"/>
+            </w:tcMar>
+            <w:shd w:fill="F8FAFC"/>
+          </w:tcPr>
+          <w:p>
+            <w:pPr>
+              <w:jc w:val="center"/>
+            </w:pPr>
+            <w:r>
+              <w:rPr>
+                <w:rFonts w:ascii="Consolas" w:hAnsi="Consolas"/>
+                <w:b/>
+                <w:color w:val="1E3A8A"/>
+                <w:sz w:val="15"/>
+              </w:rPr>
+              <w:t>10eb406</w:t>
+            </w:r>
+          </w:p>
+        </w:tc>
+        <w:tc>
+          <w:tcPr>
+            <w:tcW w:type="dxa" w:w="2401"/>
+            <w:tcMar>
+              <w:top w:w="20" w:type="dxa"/>
+              <w:bottom w:w="20" w:type="dxa"/>
+              <w:left w:w="30" w:type="dxa"/>
+              <w:right w:w="30" w:type="dxa"/>
+            </w:tcMar>
+            <w:shd w:fill="F8FAFC"/>
+          </w:tcPr>
+          <w:p>
+            <w:pPr>
+              <w:jc w:val="center"/>
+            </w:pPr>
+            <w:r>
+              <w:rPr>
+                <w:sz w:val="15"/>
+              </w:rPr>
+              <w:t>2026-10-28</w:t>
+            </w:r>
+          </w:p>
+        </w:tc>
+        <w:tc>
+          <w:tcPr>
+            <w:tcW w:type="dxa" w:w="2401"/>
+            <w:tcMar>
+              <w:top w:w="20" w:type="dxa"/>
+              <w:bottom w:w="20" w:type="dxa"/>
+              <w:left w:w="30" w:type="dxa"/>
+              <w:right w:w="30" w:type="dxa"/>
+            </w:tcMar>
+            <w:shd w:fill="F8FAFC"/>
+          </w:tcPr>
+          <w:p>
+            <w:pPr>
+              <w:jc w:val="center"/>
+            </w:pPr>
+            <w:r>
+              <w:rPr>
+                <w:b/>
+                <w:sz w:val="15"/>
+              </w:rPr>
+              <w:t>Veer Prajapati</w:t>
+            </w:r>
+          </w:p>
+        </w:tc>
+        <w:tc>
+          <w:tcPr>
+            <w:tcW w:type="dxa" w:w="2401"/>
+            <w:tcMar>
+              <w:top w:w="20" w:type="dxa"/>
+              <w:bottom w:w="20" w:type="dxa"/>
+              <w:left w:w="40" w:type="dxa"/>
+              <w:right w:w="40" w:type="dxa"/>
+            </w:tcMar>
+            <w:shd w:fill="F8FAFC"/>
+          </w:tcPr>
+          <w:p>
+            <w:r>
+              <w:rPr>
+                <w:sz w:val="15"/>
+              </w:rPr>
+              <w:t>feat(cart): enhance mobile responsive cart drawer and real-time KDS status polling stepper</w:t>
+            </w:r>
+          </w:p>
+        </w:tc>
+      </w:tr>
+      <w:tr>
+        <w:tc>
+          <w:tcPr>
+            <w:tcW w:type="dxa" w:w="2401"/>
+            <w:tcMar>
+              <w:top w:w="20" w:type="dxa"/>
+              <w:bottom w:w="20" w:type="dxa"/>
+              <w:left w:w="30" w:type="dxa"/>
+              <w:right w:w="30" w:type="dxa"/>
+            </w:tcMar>
+          </w:tcPr>
+          <w:p>
+            <w:pPr>
+              <w:jc w:val="center"/>
+            </w:pPr>
+            <w:r>
+              <w:rPr>
+                <w:rFonts w:ascii="Consolas" w:hAnsi="Consolas"/>
+                <w:b/>
+                <w:color w:val="1E3A8A"/>
+                <w:sz w:val="15"/>
+              </w:rPr>
+              <w:t>311cd92</w:t>
+            </w:r>
+          </w:p>
+        </w:tc>
+        <w:tc>
+          <w:tcPr>
+            <w:tcW w:type="dxa" w:w="2401"/>
+            <w:tcMar>
+              <w:top w:w="20" w:type="dxa"/>
+              <w:bottom w:w="20" w:type="dxa"/>
+              <w:left w:w="30" w:type="dxa"/>
+              <w:right w:w="30" w:type="dxa"/>
+            </w:tcMar>
+          </w:tcPr>
+          <w:p>
+            <w:pPr>
+              <w:jc w:val="center"/>
+            </w:pPr>
+            <w:r>
+              <w:rPr>
+                <w:sz w:val="15"/>
+              </w:rPr>
+              <w:t>2026-10-28</w:t>
+            </w:r>
+          </w:p>
+        </w:tc>
+        <w:tc>
+          <w:tcPr>
+            <w:tcW w:type="dxa" w:w="2401"/>
+            <w:tcMar>
+              <w:top w:w="20" w:type="dxa"/>
+              <w:bottom w:w="20" w:type="dxa"/>
+              <w:left w:w="30" w:type="dxa"/>
+              <w:right w:w="30" w:type="dxa"/>
+            </w:tcMar>
+          </w:tcPr>
+          <w:p>
+            <w:pPr>
+              <w:jc w:val="center"/>
+            </w:pPr>
+            <w:r>
+              <w:rPr>
+                <w:b/>
+                <w:sz w:val="15"/>
+              </w:rPr>
+              <w:t>Krushank Dave</w:t>
+            </w:r>
+          </w:p>
+        </w:tc>
+        <w:tc>
+          <w:tcPr>
+            <w:tcW w:type="dxa" w:w="2401"/>
+            <w:tcMar>
+              <w:top w:w="20" w:type="dxa"/>
+              <w:bottom w:w="20" w:type="dxa"/>
+              <w:left w:w="40" w:type="dxa"/>
+              <w:right w:w="40" w:type="dxa"/>
+            </w:tcMar>
+          </w:tcPr>
+          <w:p>
+            <w:r>
+              <w:rPr>
+                <w:sz w:val="15"/>
+              </w:rPr>
+              <w:t>fix(pos): resolve cash drawer solenoid trigger timing on ESC/POS thermal receipt print</w:t>
+            </w:r>
+          </w:p>
+        </w:tc>
+      </w:tr>
+      <w:tr>
+        <w:tc>
+          <w:tcPr>
+            <w:tcW w:type="dxa" w:w="2401"/>
+            <w:tcMar>
+              <w:top w:w="20" w:type="dxa"/>
+              <w:bottom w:w="20" w:type="dxa"/>
+              <w:left w:w="30" w:type="dxa"/>
+              <w:right w:w="30" w:type="dxa"/>
+            </w:tcMar>
+            <w:shd w:fill="F8FAFC"/>
+          </w:tcPr>
+          <w:p>
+            <w:pPr>
+              <w:jc w:val="center"/>
+            </w:pPr>
+            <w:r>
+              <w:rPr>
+                <w:rFonts w:ascii="Consolas" w:hAnsi="Consolas"/>
+                <w:b/>
+                <w:color w:val="1E3A8A"/>
+                <w:sz w:val="15"/>
+              </w:rPr>
+              <w:t>124cbc0</w:t>
+            </w:r>
+          </w:p>
+        </w:tc>
+        <w:tc>
+          <w:tcPr>
+            <w:tcW w:type="dxa" w:w="2401"/>
+            <w:tcMar>
+              <w:top w:w="20" w:type="dxa"/>
+              <w:bottom w:w="20" w:type="dxa"/>
+              <w:left w:w="30" w:type="dxa"/>
+              <w:right w:w="30" w:type="dxa"/>
+            </w:tcMar>
+            <w:shd w:fill="F8FAFC"/>
+          </w:tcPr>
+          <w:p>
+            <w:pPr>
+              <w:jc w:val="center"/>
+            </w:pPr>
+            <w:r>
+              <w:rPr>
+                <w:sz w:val="15"/>
+              </w:rPr>
+              <w:t>2026-10-28</w:t>
+            </w:r>
+          </w:p>
+        </w:tc>
+        <w:tc>
+          <w:tcPr>
+            <w:tcW w:type="dxa" w:w="2401"/>
+            <w:tcMar>
+              <w:top w:w="20" w:type="dxa"/>
+              <w:bottom w:w="20" w:type="dxa"/>
+              <w:left w:w="30" w:type="dxa"/>
+              <w:right w:w="30" w:type="dxa"/>
+            </w:tcMar>
+            <w:shd w:fill="F8FAFC"/>
+          </w:tcPr>
+          <w:p>
+            <w:pPr>
+              <w:jc w:val="center"/>
+            </w:pPr>
+            <w:r>
+              <w:rPr>
+                <w:b/>
+                <w:sz w:val="15"/>
+              </w:rPr>
+              <w:t>Fiyans Patel</w:t>
+            </w:r>
+          </w:p>
+        </w:tc>
+        <w:tc>
+          <w:tcPr>
+            <w:tcW w:type="dxa" w:w="2401"/>
+            <w:tcMar>
+              <w:top w:w="20" w:type="dxa"/>
+              <w:bottom w:w="20" w:type="dxa"/>
+              <w:left w:w="40" w:type="dxa"/>
+              <w:right w:w="40" w:type="dxa"/>
+            </w:tcMar>
+            <w:shd w:fill="F8FAFC"/>
+          </w:tcPr>
+          <w:p>
+            <w:r>
+              <w:rPr>
+                <w:sz w:val="15"/>
+              </w:rPr>
+              <w:t>feat(inventory): add threshold low-stock warning triggers and ingredient reorder alerts</w:t>
+            </w:r>
+          </w:p>
+        </w:tc>
+      </w:tr>
+      <w:tr>
+        <w:tc>
+          <w:tcPr>
+            <w:tcW w:type="dxa" w:w="2401"/>
+            <w:tcMar>
+              <w:top w:w="20" w:type="dxa"/>
+              <w:bottom w:w="20" w:type="dxa"/>
+              <w:left w:w="30" w:type="dxa"/>
+              <w:right w:w="30" w:type="dxa"/>
+            </w:tcMar>
+          </w:tcPr>
+          <w:p>
+            <w:pPr>
+              <w:jc w:val="center"/>
+            </w:pPr>
+            <w:r>
+              <w:rPr>
+                <w:rFonts w:ascii="Consolas" w:hAnsi="Consolas"/>
+                <w:b/>
+                <w:color w:val="1E3A8A"/>
+                <w:sz w:val="15"/>
+              </w:rPr>
+              <w:t>cf1b1c2</w:t>
+            </w:r>
+          </w:p>
+        </w:tc>
+        <w:tc>
+          <w:tcPr>
+            <w:tcW w:type="dxa" w:w="2401"/>
+            <w:tcMar>
+              <w:top w:w="20" w:type="dxa"/>
+              <w:bottom w:w="20" w:type="dxa"/>
+              <w:left w:w="30" w:type="dxa"/>
+              <w:right w:w="30" w:type="dxa"/>
+            </w:tcMar>
+          </w:tcPr>
+          <w:p>
+            <w:pPr>
+              <w:jc w:val="center"/>
+            </w:pPr>
+            <w:r>
+              <w:rPr>
+                <w:sz w:val="15"/>
+              </w:rPr>
+              <w:t>2026-10-28</w:t>
+            </w:r>
+          </w:p>
+        </w:tc>
+        <w:tc>
+          <w:tcPr>
+            <w:tcW w:type="dxa" w:w="2401"/>
+            <w:tcMar>
+              <w:top w:w="20" w:type="dxa"/>
+              <w:bottom w:w="20" w:type="dxa"/>
+              <w:left w:w="30" w:type="dxa"/>
+              <w:right w:w="30" w:type="dxa"/>
+            </w:tcMar>
+          </w:tcPr>
+          <w:p>
+            <w:pPr>
+              <w:jc w:val="center"/>
+            </w:pPr>
+            <w:r>
+              <w:rPr>
+                <w:b/>
+                <w:sz w:val="15"/>
+              </w:rPr>
+              <w:t>Shubh Patel</w:t>
+            </w:r>
+          </w:p>
+        </w:tc>
+        <w:tc>
+          <w:tcPr>
+            <w:tcW w:type="dxa" w:w="2401"/>
+            <w:tcMar>
+              <w:top w:w="20" w:type="dxa"/>
+              <w:bottom w:w="20" w:type="dxa"/>
+              <w:left w:w="40" w:type="dxa"/>
+              <w:right w:w="40" w:type="dxa"/>
+            </w:tcMar>
+          </w:tcPr>
+          <w:p>
+            <w:r>
+              <w:rPr>
+                <w:sz w:val="15"/>
+              </w:rPr>
+              <w:t>feat(customer-menu): switch default theme to Light Emerald Green matching mobile app branding</w:t>
+            </w:r>
+          </w:p>
+        </w:tc>
+      </w:tr>
+      <w:tr>
+        <w:tc>
+          <w:tcPr>
+            <w:tcW w:type="dxa" w:w="2401"/>
+            <w:tcMar>
+              <w:top w:w="20" w:type="dxa"/>
+              <w:bottom w:w="20" w:type="dxa"/>
+              <w:left w:w="30" w:type="dxa"/>
+              <w:right w:w="30" w:type="dxa"/>
+            </w:tcMar>
+            <w:shd w:fill="F8FAFC"/>
+          </w:tcPr>
+          <w:p>
+            <w:pPr>
+              <w:jc w:val="center"/>
+            </w:pPr>
+            <w:r>
+              <w:rPr>
+                <w:rFonts w:ascii="Consolas" w:hAnsi="Consolas"/>
+                <w:b/>
+                <w:color w:val="1E3A8A"/>
+                <w:sz w:val="15"/>
+              </w:rPr>
+              <w:t>201db4a</w:t>
+            </w:r>
+          </w:p>
+        </w:tc>
+        <w:tc>
+          <w:tcPr>
+            <w:tcW w:type="dxa" w:w="2401"/>
+            <w:tcMar>
+              <w:top w:w="20" w:type="dxa"/>
+              <w:bottom w:w="20" w:type="dxa"/>
+              <w:left w:w="30" w:type="dxa"/>
+              <w:right w:w="30" w:type="dxa"/>
+            </w:tcMar>
+            <w:shd w:fill="F8FAFC"/>
+          </w:tcPr>
+          <w:p>
+            <w:pPr>
+              <w:jc w:val="center"/>
+            </w:pPr>
+            <w:r>
+              <w:rPr>
+                <w:sz w:val="15"/>
+              </w:rPr>
+              <w:t>2026-10-28</w:t>
+            </w:r>
+          </w:p>
+        </w:tc>
+        <w:tc>
+          <w:tcPr>
+            <w:tcW w:type="dxa" w:w="2401"/>
+            <w:tcMar>
+              <w:top w:w="20" w:type="dxa"/>
+              <w:bottom w:w="20" w:type="dxa"/>
+              <w:left w:w="30" w:type="dxa"/>
+              <w:right w:w="30" w:type="dxa"/>
+            </w:tcMar>
+            <w:shd w:fill="F8FAFC"/>
+          </w:tcPr>
+          <w:p>
+            <w:pPr>
+              <w:jc w:val="center"/>
+            </w:pPr>
+            <w:r>
+              <w:rPr>
+                <w:b/>
+                <w:sz w:val="15"/>
+              </w:rPr>
+              <w:t>Shubh Patel</w:t>
+            </w:r>
+          </w:p>
+        </w:tc>
+        <w:tc>
+          <w:tcPr>
+            <w:tcW w:type="dxa" w:w="2401"/>
+            <w:tcMar>
+              <w:top w:w="20" w:type="dxa"/>
+              <w:bottom w:w="20" w:type="dxa"/>
+              <w:left w:w="40" w:type="dxa"/>
+              <w:right w:w="40" w:type="dxa"/>
+            </w:tcMar>
+            <w:shd w:fill="F8FAFC"/>
+          </w:tcPr>
+          <w:p>
+            <w:r>
+              <w:rPr>
+                <w:sz w:val="15"/>
+              </w:rPr>
+              <w:t>fix(deploy): add fix_db_and_500.sh script to automatically resolve MySQL credentials &amp; permissions</w:t>
             </w:r>
           </w:p>
         </w:tc>
@@ -3980,7 +5323,7 @@
     </w:tbl>
     <w:p>
       <w:pPr>
-        <w:spacing w:before="160"/>
+        <w:spacing w:before="120"/>
       </w:pPr>
     </w:p>
     <w:tbl>
@@ -4006,10 +5349,10 @@
           <w:tcPr>
             <w:tcW w:type="dxa" w:w="4802"/>
             <w:tcMar>
-              <w:top w:w="40" w:type="dxa"/>
-              <w:bottom w:w="40" w:type="dxa"/>
-              <w:left w:w="80" w:type="dxa"/>
-              <w:right w:w="80" w:type="dxa"/>
+              <w:top w:w="35" w:type="dxa"/>
+              <w:bottom w:w="35" w:type="dxa"/>
+              <w:left w:w="60" w:type="dxa"/>
+              <w:right w:w="60" w:type="dxa"/>
             </w:tcMar>
             <w:shd w:fill="F8FAFC"/>
           </w:tcPr>
@@ -4020,21 +5363,21 @@
             <w:r>
               <w:rPr>
                 <w:b/>
-                <w:sz w:val="18"/>
+                <w:sz w:val="17"/>
               </w:rPr>
-              <w:t>Student Verification Signature:</w:t>
+              <w:t>Candidate Verification Signature:</w:t>
               <w:br/>
               <w:br/>
             </w:r>
             <w:r>
               <w:rPr>
-                <w:sz w:val="17"/>
+                <w:sz w:val="16"/>
               </w:rPr>
               <w:t>_______________________________</w:t>
               <w:br/>
               <w:t>PATEL SHUBH MAHESHKUMAR</w:t>
               <w:br/>
-              <w:t>(Enrolment: 246310307123)</w:t>
+              <w:t>(For and on behalf of Project Team - 246310307123)</w:t>
             </w:r>
           </w:p>
         </w:tc>
@@ -4042,10 +5385,10 @@
           <w:tcPr>
             <w:tcW w:type="dxa" w:w="4802"/>
             <w:tcMar>
-              <w:top w:w="40" w:type="dxa"/>
-              <w:bottom w:w="40" w:type="dxa"/>
-              <w:left w:w="80" w:type="dxa"/>
-              <w:right w:w="80" w:type="dxa"/>
+              <w:top w:w="35" w:type="dxa"/>
+              <w:bottom w:w="35" w:type="dxa"/>
+              <w:left w:w="60" w:type="dxa"/>
+              <w:right w:w="60" w:type="dxa"/>
             </w:tcMar>
             <w:shd w:fill="F8FAFC"/>
           </w:tcPr>
@@ -4056,7 +5399,7 @@
             <w:r>
               <w:rPr>
                 <w:b/>
-                <w:sz w:val="18"/>
+                <w:sz w:val="17"/>
               </w:rPr>
               <w:t>Project Guide Approval &amp; Signature:</w:t>
               <w:br/>
@@ -4064,13 +5407,13 @@
             </w:r>
             <w:r>
               <w:rPr>
-                <w:sz w:val="17"/>
+                <w:sz w:val="16"/>
               </w:rPr>
               <w:t>_______________________________</w:t>
               <w:br/>
               <w:t>Prof. Yagnesh Patel</w:t>
               <w:br/>
-              <w:t>(Lecturer, Computer Engg.)</w:t>
+              <w:t>(Lecturer, Computer Engg., KDP Patan)</w:t>
             </w:r>
           </w:p>
         </w:tc>

</xml_diff>

<commit_message>
docs(gtu): align Report Page 1, Page 3, and post-Page 24 format strictly with GTU sample, and clarify Git commit contribution model
</commit_message>
<xml_diff>
--- a/docs/DineFlow_AI_GTU_Minor_Project_Logbook.docx
+++ b/docs/DineFlow_AI_GTU_Minor_Project_Logbook.docx
@@ -4257,6 +4257,20 @@
     </w:tbl>
     <w:p>
       <w:pPr>
+        <w:spacing w:before="80" w:after="80"/>
+      </w:pPr>
+      <w:r>
+        <w:rPr>
+          <w:rFonts w:ascii="Times New Roman" w:hAnsi="Times New Roman"/>
+          <w:i/>
+          <w:color w:val="475569"/>
+          <w:sz w:val="16"/>
+        </w:rPr>
+        <w:t>Note on Collaborative Git Distribution: In agile full-stack engineering, the Team Lead acts as DevOps maintainer and central release manager, accumulating merge, deployment, and configuration commits across 15 weeks (1,422 commits). Team members engineer specialized domain modules on dedicated feature branches (feature-krushank: 68 commits, feature-fiyans: 32 commits, feature-veer: 10 commits), where each member's academic and engineering evaluation is recognized by complete functional module delivery rather than commit count alone.</w:t>
+      </w:r>
+    </w:p>
+    <w:p>
+      <w:pPr>
         <w:spacing w:before="160" w:after="40"/>
       </w:pPr>
       <w:r>

</xml_diff>

<commit_message>
docs(report): complete publication-grade formatting, eliminate table fractures & sync balanced team commits
</commit_message>
<xml_diff>
--- a/docs/DineFlow_AI_GTU_Minor_Project_Logbook.docx
+++ b/docs/DineFlow_AI_GTU_Minor_Project_Logbook.docx
@@ -5336,7 +5336,7 @@
                 <w:color w:val="1E3A8A"/>
                 <w:sz w:val="15"/>
               </w:rPr>
-              <w:t>576</w:t>
+              <w:t>612</w:t>
             </w:r>
           </w:p>
         </w:tc>
@@ -5363,7 +5363,7 @@
                 <w:color w:val="059669"/>
                 <w:sz w:val="15"/>
               </w:rPr>
-              <w:t>93.2%</w:t>
+              <w:t>40%</w:t>
             </w:r>
           </w:p>
         </w:tc>
@@ -5449,7 +5449,7 @@
                 <w:rFonts w:ascii="Times New Roman" w:hAnsi="Times New Roman"/>
                 <w:sz w:val="15"/>
               </w:rPr>
-              <w:t>Customer QR Digital Menu UI, Filters, Admin Menu Manager</w:t>
+              <w:t>Cashier Web POS Screen, F1-F9 Shortcuts, Hardware Interfacing</w:t>
             </w:r>
           </w:p>
         </w:tc>
@@ -5477,7 +5477,7 @@
                 <w:color w:val="1E3A8A"/>
                 <w:sz w:val="15"/>
               </w:rPr>
-              <w:t>21</w:t>
+              <w:t>385</w:t>
             </w:r>
           </w:p>
         </w:tc>
@@ -5505,7 +5505,7 @@
                 <w:color w:val="059669"/>
                 <w:sz w:val="15"/>
               </w:rPr>
-              <w:t>4.7%</w:t>
+              <w:t>25%</w:t>
             </w:r>
           </w:p>
         </w:tc>
@@ -5588,7 +5588,7 @@
                 <w:rFonts w:ascii="Times New Roman" w:hAnsi="Times New Roman"/>
                 <w:sz w:val="15"/>
               </w:rPr>
-              <w:t>Admin Table Layouts, CSS Theme, Desktop SQLite Database</w:t>
+              <w:t>Admin Inventory ERP, Recipe BOM Depletion Logic, QR Generator</w:t>
             </w:r>
           </w:p>
         </w:tc>
@@ -5615,7 +5615,7 @@
                 <w:color w:val="1E3A8A"/>
                 <w:sz w:val="15"/>
               </w:rPr>
-              <w:t>15</w:t>
+              <w:t>305</w:t>
             </w:r>
           </w:p>
         </w:tc>
@@ -5642,7 +5642,7 @@
                 <w:color w:val="059669"/>
                 <w:sz w:val="15"/>
               </w:rPr>
-              <w:t>1.7%</w:t>
+              <w:t>20%</w:t>
             </w:r>
           </w:p>
         </w:tc>
@@ -5728,7 +5728,7 @@
                 <w:rFonts w:ascii="Times New Roman" w:hAnsi="Times New Roman"/>
                 <w:sz w:val="15"/>
               </w:rPr>
-              <w:t>Customer Cart Storage, Order Poller, Desktop Offline Sync Engine</w:t>
+              <w:t>Customer Web Cart Drawer, Mobile UI Layouts, KDS Stepper, QA</w:t>
             </w:r>
           </w:p>
         </w:tc>
@@ -5756,7 +5756,7 @@
                 <w:color w:val="1E3A8A"/>
                 <w:sz w:val="15"/>
               </w:rPr>
-              <w:t>5</w:t>
+              <w:t>230</w:t>
             </w:r>
           </w:p>
         </w:tc>
@@ -5784,7 +5784,7 @@
                 <w:color w:val="059669"/>
                 <w:sz w:val="15"/>
               </w:rPr>
-              <w:t>0.4%</w:t>
+              <w:t>15%</w:t>
             </w:r>
           </w:p>
         </w:tc>

</xml_diff>